<commit_message>
agregar pdf CMI y modificacion contextualizacion
</commit_message>
<xml_diff>
--- a/01_proyecto/trim7/Manuales/Plan del Proyecto CMMI Nivel 2.docx
+++ b/01_proyecto/trim7/Manuales/Plan del Proyecto CMMI Nivel 2.docx
@@ -496,16 +496,27 @@
         <w:pStyle w:val="Sinespaciado"/>
         <w:ind w:left="720"/>
         <w:rPr>
-          <w:sz w:val="24"/>
-        </w:rPr>
-      </w:pPr>
-      <w:r>
-        <w:rPr>
-          <w:sz w:val="24"/>
-          <w:lang w:val="es-MX"/>
-        </w:rPr>
-        <w:t>El sistema abarcará el desarrollo de una aplicación web integral. Incluirá funcionalidades de comercio electrónico y administración completa de usuarios (clientes y administradores). Un proceso de compra automatizado, administración de inventario, implementación de promociones y generación de reportes para análisis de datos.</w:t>
-      </w:r>
+          <w:b/>
+          <w:sz w:val="24"/>
+        </w:rPr>
+      </w:pPr>
+      <w:r>
+        <w:rPr>
+          <w:b/>
+          <w:sz w:val="24"/>
+        </w:rPr>
+        <w:t>Incluye:</w:t>
+      </w:r>
+    </w:p>
+    <w:p>
+      <w:pPr>
+        <w:pStyle w:val="Sinespaciado"/>
+        <w:rPr>
+          <w:b/>
+          <w:sz w:val="24"/>
+          <w:u w:val="single"/>
+        </w:rPr>
+      </w:pPr>
     </w:p>
     <w:p>
       <w:pPr>
@@ -515,22 +526,13 @@
           <w:sz w:val="24"/>
         </w:rPr>
       </w:pPr>
-    </w:p>
-    <w:p>
-      <w:pPr>
-        <w:pStyle w:val="Sinespaciado"/>
-        <w:ind w:left="720"/>
-        <w:rPr>
-          <w:b/>
-          <w:sz w:val="24"/>
-        </w:rPr>
-      </w:pPr>
-      <w:r>
-        <w:rPr>
-          <w:b/>
-          <w:sz w:val="24"/>
-        </w:rPr>
-        <w:t>Incluye:</w:t>
+      <w:r>
+        <w:rPr>
+          <w:b/>
+          <w:bCs/>
+          <w:sz w:val="24"/>
+        </w:rPr>
+        <w:t>Usuarios (Clientes):</w:t>
       </w:r>
     </w:p>
     <w:p>
@@ -538,25 +540,17 @@
         <w:pStyle w:val="Sinespaciado"/>
         <w:numPr>
           <w:ilvl w:val="0"/>
-          <w:numId w:val="2"/>
+          <w:numId w:val="6"/>
         </w:numPr>
         <w:rPr>
-          <w:b/>
-          <w:sz w:val="24"/>
-        </w:rPr>
-      </w:pPr>
-      <w:r>
-        <w:rPr>
-          <w:sz w:val="24"/>
-          <w:lang w:val="es-MX"/>
-        </w:rPr>
-        <w:t>Gestionar usuarios mediante registro, inicio de sesión y recuperación de contraseña</w:t>
-      </w:r>
-      <w:r>
-        <w:rPr>
-          <w:sz w:val="24"/>
-        </w:rPr>
-        <w:t>Control de Inventarios</w:t>
+          <w:sz w:val="24"/>
+        </w:rPr>
+      </w:pPr>
+      <w:r>
+        <w:rPr>
+          <w:sz w:val="24"/>
+        </w:rPr>
+        <w:t>Inicio de sesión y administración de perfil</w:t>
       </w:r>
     </w:p>
     <w:p>
@@ -564,19 +558,17 @@
         <w:pStyle w:val="Sinespaciado"/>
         <w:numPr>
           <w:ilvl w:val="0"/>
-          <w:numId w:val="2"/>
+          <w:numId w:val="6"/>
         </w:numPr>
         <w:rPr>
-          <w:b/>
-          <w:sz w:val="24"/>
-        </w:rPr>
-      </w:pPr>
-      <w:r>
-        <w:rPr>
-          <w:sz w:val="24"/>
-          <w:lang w:val="es-MX"/>
-        </w:rPr>
-        <w:t xml:space="preserve">Gestionar los productos </w:t>
+          <w:sz w:val="24"/>
+        </w:rPr>
+      </w:pPr>
+      <w:r>
+        <w:rPr>
+          <w:sz w:val="24"/>
+        </w:rPr>
+        <w:t>Visualización del catálogo de productos con filtros de búsqueda</w:t>
       </w:r>
     </w:p>
     <w:p>
@@ -584,35 +576,17 @@
         <w:pStyle w:val="Sinespaciado"/>
         <w:numPr>
           <w:ilvl w:val="0"/>
-          <w:numId w:val="2"/>
+          <w:numId w:val="6"/>
         </w:numPr>
         <w:rPr>
-          <w:b/>
-          <w:sz w:val="24"/>
-        </w:rPr>
-      </w:pPr>
-      <w:r>
-        <w:rPr>
-          <w:sz w:val="24"/>
-          <w:lang w:val="es-MX"/>
-        </w:rPr>
-        <w:t xml:space="preserve">Gestionar las ventas de los productos a través de la generación de </w:t>
-      </w:r>
-      <w:proofErr w:type="gramStart"/>
-      <w:r>
-        <w:rPr>
-          <w:sz w:val="24"/>
-          <w:lang w:val="es-MX"/>
-        </w:rPr>
-        <w:t>tickets</w:t>
-      </w:r>
-      <w:proofErr w:type="gramEnd"/>
-      <w:r>
-        <w:rPr>
-          <w:sz w:val="24"/>
-          <w:lang w:val="es-MX"/>
-        </w:rPr>
-        <w:t xml:space="preserve"> y seguimiento de pedidos</w:t>
+          <w:sz w:val="24"/>
+        </w:rPr>
+      </w:pPr>
+      <w:r>
+        <w:rPr>
+          <w:sz w:val="24"/>
+        </w:rPr>
+        <w:t>Gestión de carrito de compras y lista de favoritos</w:t>
       </w:r>
     </w:p>
     <w:p>
@@ -620,20 +594,17 @@
         <w:pStyle w:val="Sinespaciado"/>
         <w:numPr>
           <w:ilvl w:val="0"/>
-          <w:numId w:val="2"/>
+          <w:numId w:val="6"/>
         </w:numPr>
         <w:rPr>
-          <w:bCs/>
-          <w:sz w:val="24"/>
-        </w:rPr>
-      </w:pPr>
-      <w:r>
-        <w:rPr>
-          <w:bCs/>
-          <w:sz w:val="24"/>
-          <w:lang w:val="es-MX"/>
-        </w:rPr>
-        <w:t>Gestionar métodos de pago en las ventas</w:t>
+          <w:sz w:val="24"/>
+        </w:rPr>
+      </w:pPr>
+      <w:r>
+        <w:rPr>
+          <w:sz w:val="24"/>
+        </w:rPr>
+        <w:t>Proceso de compra: selección de productos del carrito, registro de método de pago y dirección de envío</w:t>
       </w:r>
     </w:p>
     <w:p>
@@ -641,20 +612,31 @@
         <w:pStyle w:val="Sinespaciado"/>
         <w:numPr>
           <w:ilvl w:val="0"/>
-          <w:numId w:val="2"/>
+          <w:numId w:val="6"/>
         </w:numPr>
         <w:rPr>
-          <w:bCs/>
-          <w:sz w:val="24"/>
-        </w:rPr>
-      </w:pPr>
-      <w:r>
-        <w:rPr>
-          <w:bCs/>
-          <w:sz w:val="24"/>
-          <w:lang w:val="es-MX"/>
-        </w:rPr>
-        <w:t>Gestionar las promociones</w:t>
+          <w:sz w:val="24"/>
+        </w:rPr>
+      </w:pPr>
+      <w:r>
+        <w:rPr>
+          <w:sz w:val="24"/>
+        </w:rPr>
+        <w:t xml:space="preserve">Valoración </w:t>
+      </w:r>
+      <w:proofErr w:type="spellStart"/>
+      <w:r>
+        <w:rPr>
+          <w:sz w:val="24"/>
+        </w:rPr>
+        <w:t>post-compra</w:t>
+      </w:r>
+      <w:proofErr w:type="spellEnd"/>
+      <w:r>
+        <w:rPr>
+          <w:sz w:val="24"/>
+        </w:rPr>
+        <w:t>: calificación de 5 estrellas y reseña descriptiva</w:t>
       </w:r>
     </w:p>
     <w:p>
@@ -662,43 +644,48 @@
         <w:pStyle w:val="Sinespaciado"/>
         <w:numPr>
           <w:ilvl w:val="0"/>
-          <w:numId w:val="2"/>
+          <w:numId w:val="6"/>
         </w:numPr>
         <w:rPr>
+          <w:sz w:val="24"/>
+        </w:rPr>
+      </w:pPr>
+      <w:r>
+        <w:rPr>
+          <w:sz w:val="24"/>
+        </w:rPr>
+        <w:t xml:space="preserve">Generación de </w:t>
+      </w:r>
+      <w:proofErr w:type="gramStart"/>
+      <w:r>
+        <w:rPr>
+          <w:sz w:val="24"/>
+        </w:rPr>
+        <w:t>ticket</w:t>
+      </w:r>
+      <w:proofErr w:type="gramEnd"/>
+      <w:r>
+        <w:rPr>
+          <w:sz w:val="24"/>
+        </w:rPr>
+        <w:t xml:space="preserve"> o comprobante de venta (sin facturación DIAN)</w:t>
+      </w:r>
+    </w:p>
+    <w:p>
+      <w:pPr>
+        <w:pStyle w:val="Sinespaciado"/>
+        <w:ind w:left="720"/>
+        <w:rPr>
+          <w:sz w:val="24"/>
+        </w:rPr>
+      </w:pPr>
+      <w:r>
+        <w:rPr>
+          <w:b/>
           <w:bCs/>
           <w:sz w:val="24"/>
         </w:rPr>
-      </w:pPr>
-      <w:r>
-        <w:rPr>
-          <w:bCs/>
-          <w:sz w:val="24"/>
-          <w:lang w:val="es-MX"/>
-        </w:rPr>
-        <w:t>Generar reportes sobre usuarios, productos y ventas</w:t>
-      </w:r>
-    </w:p>
-    <w:p>
-      <w:pPr>
-        <w:pStyle w:val="Sinespaciado"/>
-        <w:ind w:left="360"/>
-        <w:rPr>
-          <w:b/>
-          <w:sz w:val="24"/>
-        </w:rPr>
-      </w:pPr>
-      <w:r>
-        <w:rPr>
-          <w:sz w:val="24"/>
-        </w:rPr>
-        <w:t xml:space="preserve">       </w:t>
-      </w:r>
-      <w:r>
-        <w:rPr>
-          <w:b/>
-          <w:sz w:val="24"/>
-        </w:rPr>
-        <w:t>No incluye:</w:t>
+        <w:t>Administradores:</w:t>
       </w:r>
     </w:p>
     <w:p>
@@ -706,27 +693,164 @@
         <w:pStyle w:val="Sinespaciado"/>
         <w:numPr>
           <w:ilvl w:val="0"/>
-          <w:numId w:val="3"/>
+          <w:numId w:val="7"/>
         </w:numPr>
-        <w:ind w:left="1418"/>
-        <w:rPr>
+        <w:rPr>
+          <w:sz w:val="24"/>
+        </w:rPr>
+      </w:pPr>
+      <w:r>
+        <w:rPr>
+          <w:sz w:val="24"/>
+        </w:rPr>
+        <w:t>Inicio de sesión con privilegios administrativos</w:t>
+      </w:r>
+    </w:p>
+    <w:p>
+      <w:pPr>
+        <w:pStyle w:val="Sinespaciado"/>
+        <w:numPr>
+          <w:ilvl w:val="0"/>
+          <w:numId w:val="7"/>
+        </w:numPr>
+        <w:rPr>
+          <w:sz w:val="24"/>
+        </w:rPr>
+      </w:pPr>
+      <w:r>
+        <w:rPr>
+          <w:sz w:val="24"/>
+        </w:rPr>
+        <w:t>Gestión de productos: control de visibilidad basado en stock, actualización de precios y descripciones</w:t>
+      </w:r>
+    </w:p>
+    <w:p>
+      <w:pPr>
+        <w:pStyle w:val="Sinespaciado"/>
+        <w:ind w:left="360"/>
+        <w:rPr>
+          <w:sz w:val="24"/>
+        </w:rPr>
+      </w:pPr>
+    </w:p>
+    <w:p>
+      <w:pPr>
+        <w:pStyle w:val="Sinespaciado"/>
+        <w:ind w:left="360"/>
+        <w:rPr>
+          <w:sz w:val="24"/>
+        </w:rPr>
+      </w:pPr>
+      <w:r>
+        <w:rPr>
+          <w:b/>
+          <w:sz w:val="24"/>
+        </w:rPr>
+        <w:t>No incluye:</w:t>
+      </w:r>
+    </w:p>
+    <w:p>
+      <w:pPr>
+        <w:pStyle w:val="Sinespaciado"/>
+        <w:ind w:left="720"/>
+        <w:rPr>
+          <w:sz w:val="24"/>
+        </w:rPr>
+      </w:pPr>
+      <w:r>
+        <w:rPr>
+          <w:b/>
           <w:bCs/>
           <w:sz w:val="24"/>
         </w:rPr>
-      </w:pPr>
-      <w:r>
-        <w:rPr>
-          <w:bCs/>
-          <w:sz w:val="24"/>
-          <w:lang w:val="es-MX"/>
-        </w:rPr>
-        <w:t>El sistema no envía los productos al cliente</w:t>
-      </w:r>
-    </w:p>
-    <w:p>
-      <w:pPr>
-        <w:pStyle w:val="Sinespaciado"/>
-        <w:ind w:left="1418"/>
+        <w:t>Consideraciones clave:</w:t>
+      </w:r>
+    </w:p>
+    <w:p>
+      <w:pPr>
+        <w:pStyle w:val="Sinespaciado"/>
+        <w:numPr>
+          <w:ilvl w:val="0"/>
+          <w:numId w:val="8"/>
+        </w:numPr>
+        <w:rPr>
+          <w:sz w:val="24"/>
+        </w:rPr>
+      </w:pPr>
+      <w:r>
+        <w:rPr>
+          <w:sz w:val="24"/>
+        </w:rPr>
+        <w:t>El sistema actúa como intermediario comercial, no gestiona la logística de envíos</w:t>
+      </w:r>
+    </w:p>
+    <w:p>
+      <w:pPr>
+        <w:pStyle w:val="Sinespaciado"/>
+        <w:numPr>
+          <w:ilvl w:val="0"/>
+          <w:numId w:val="8"/>
+        </w:numPr>
+        <w:rPr>
+          <w:sz w:val="24"/>
+        </w:rPr>
+      </w:pPr>
+      <w:r>
+        <w:rPr>
+          <w:sz w:val="24"/>
+        </w:rPr>
+        <w:t xml:space="preserve">La distribución física es responsabilidad de </w:t>
+      </w:r>
+      <w:proofErr w:type="spellStart"/>
+      <w:r>
+        <w:rPr>
+          <w:sz w:val="24"/>
+        </w:rPr>
+        <w:t>Innovation</w:t>
+      </w:r>
+      <w:proofErr w:type="spellEnd"/>
+      <w:r>
+        <w:rPr>
+          <w:sz w:val="24"/>
+        </w:rPr>
+        <w:t xml:space="preserve"> </w:t>
+      </w:r>
+      <w:proofErr w:type="spellStart"/>
+      <w:r>
+        <w:rPr>
+          <w:sz w:val="24"/>
+        </w:rPr>
+        <w:t>Fusion</w:t>
+      </w:r>
+      <w:proofErr w:type="spellEnd"/>
+      <w:r>
+        <w:rPr>
+          <w:sz w:val="24"/>
+        </w:rPr>
+        <w:t xml:space="preserve"> y la empresa de mensajería</w:t>
+      </w:r>
+    </w:p>
+    <w:p>
+      <w:pPr>
+        <w:pStyle w:val="Sinespaciado"/>
+        <w:numPr>
+          <w:ilvl w:val="0"/>
+          <w:numId w:val="8"/>
+        </w:numPr>
+        <w:rPr>
+          <w:sz w:val="24"/>
+        </w:rPr>
+      </w:pPr>
+      <w:r>
+        <w:rPr>
+          <w:sz w:val="24"/>
+        </w:rPr>
+        <w:t>El sistema no realiza facturación oficial (DIAN), solo emite comprobantes internos</w:t>
+      </w:r>
+    </w:p>
+    <w:p>
+      <w:pPr>
+        <w:pStyle w:val="Sinespaciado"/>
         <w:rPr>
           <w:bCs/>
           <w:sz w:val="24"/>
@@ -765,6 +889,58 @@
         </w:rPr>
         <w:t>Requisitos Principales</w:t>
       </w:r>
+    </w:p>
+    <w:p>
+      <w:pPr>
+        <w:pStyle w:val="Sinespaciado"/>
+        <w:ind w:firstLine="360"/>
+        <w:rPr>
+          <w:b/>
+          <w:sz w:val="24"/>
+          <w:u w:val="single"/>
+        </w:rPr>
+      </w:pPr>
+    </w:p>
+    <w:p>
+      <w:pPr>
+        <w:pStyle w:val="Sinespaciado"/>
+        <w:ind w:firstLine="360"/>
+        <w:rPr>
+          <w:b/>
+          <w:sz w:val="24"/>
+          <w:u w:val="single"/>
+        </w:rPr>
+      </w:pPr>
+      <w:hyperlink r:id="rId7" w:history="1">
+        <w:proofErr w:type="spellStart"/>
+        <w:r>
+          <w:rPr>
+            <w:rStyle w:val="Hipervnculo"/>
+            <w:b/>
+            <w:sz w:val="24"/>
+          </w:rPr>
+          <w:t>zefiro</w:t>
+        </w:r>
+        <w:proofErr w:type="spellEnd"/>
+        <w:r>
+          <w:rPr>
+            <w:rStyle w:val="Hipervnculo"/>
+            <w:b/>
+            <w:sz w:val="24"/>
+          </w:rPr>
+          <w:t>/01_proyecto/trim1/04_requerimientos/IEEE.pdf at Test · Katherin-22/</w:t>
+        </w:r>
+        <w:proofErr w:type="spellStart"/>
+        <w:r>
+          <w:rPr>
+            <w:rStyle w:val="Hipervnculo"/>
+            <w:b/>
+            <w:sz w:val="24"/>
+          </w:rPr>
+          <w:t>zefiro</w:t>
+        </w:r>
+        <w:proofErr w:type="spellEnd"/>
+      </w:hyperlink>
     </w:p>
     <w:p>
       <w:pPr>
@@ -976,7 +1152,6 @@
               </w:rPr>
             </w:pPr>
             <w:r>
-              <w:lastRenderedPageBreak/>
               <w:t>RF00</w:t>
             </w:r>
             <w:r>
@@ -1577,15 +1752,16 @@
             <w:pPr>
               <w:pStyle w:val="Sinespaciado"/>
               <w:rPr>
-                <w:sz w:val="24"/>
-              </w:rPr>
-            </w:pPr>
-            <w:r>
-              <w:rPr>
                 <w:rFonts w:ascii="Arial" w:eastAsia="Arial" w:hAnsi="Arial" w:cs="Arial"/>
                 <w:bCs/>
               </w:rPr>
-              <w:t>Integrar opiniones y reseñas</w:t>
+            </w:pPr>
+            <w:r>
+              <w:rPr>
+                <w:rFonts w:ascii="Arial" w:eastAsia="Arial" w:hAnsi="Arial" w:cs="Arial"/>
+                <w:bCs/>
+              </w:rPr>
+              <w:t>Integrar opiniones y Reseñas</w:t>
             </w:r>
           </w:p>
         </w:tc>
@@ -1634,7 +1810,6 @@
             <w:pPr>
               <w:pStyle w:val="Sinespaciado"/>
               <w:rPr>
-                <w:bCs/>
                 <w:sz w:val="24"/>
               </w:rPr>
             </w:pPr>
@@ -1643,7 +1818,7 @@
                 <w:rFonts w:ascii="Arial" w:eastAsia="Arial" w:hAnsi="Arial" w:cs="Arial"/>
                 <w:bCs/>
               </w:rPr>
-              <w:t>Gestionar productos</w:t>
+              <w:t>Integrar opiniones y reseñas</w:t>
             </w:r>
           </w:p>
         </w:tc>
@@ -1662,7 +1837,7 @@
               <w:rPr>
                 <w:sz w:val="24"/>
               </w:rPr>
-              <w:t>Alta</w:t>
+              <w:t>Baja</w:t>
             </w:r>
           </w:p>
         </w:tc>
@@ -1692,6 +1867,7 @@
             <w:pPr>
               <w:pStyle w:val="Sinespaciado"/>
               <w:rPr>
+                <w:bCs/>
                 <w:sz w:val="24"/>
               </w:rPr>
             </w:pPr>
@@ -1700,7 +1876,7 @@
                 <w:rFonts w:ascii="Arial" w:eastAsia="Arial" w:hAnsi="Arial" w:cs="Arial"/>
                 <w:bCs/>
               </w:rPr>
-              <w:t>Gestionar inventario y colores</w:t>
+              <w:t>Gestionar productos</w:t>
             </w:r>
           </w:p>
         </w:tc>
@@ -1757,7 +1933,7 @@
                 <w:rFonts w:ascii="Arial" w:eastAsia="Arial" w:hAnsi="Arial" w:cs="Arial"/>
                 <w:bCs/>
               </w:rPr>
-              <w:t>Administrar categorías</w:t>
+              <w:t>Gestionar inventario y colores</w:t>
             </w:r>
           </w:p>
         </w:tc>
@@ -1814,6 +1990,63 @@
                 <w:rFonts w:ascii="Arial" w:eastAsia="Arial" w:hAnsi="Arial" w:cs="Arial"/>
                 <w:bCs/>
               </w:rPr>
+              <w:t>Administrar categorías</w:t>
+            </w:r>
+          </w:p>
+        </w:tc>
+        <w:tc>
+          <w:tcPr>
+            <w:tcW w:w="2588" w:type="dxa"/>
+          </w:tcPr>
+          <w:p>
+            <w:pPr>
+              <w:pStyle w:val="Sinespaciado"/>
+              <w:rPr>
+                <w:sz w:val="24"/>
+              </w:rPr>
+            </w:pPr>
+            <w:r>
+              <w:rPr>
+                <w:sz w:val="24"/>
+              </w:rPr>
+              <w:t>Alta</w:t>
+            </w:r>
+          </w:p>
+        </w:tc>
+      </w:tr>
+      <w:tr>
+        <w:tc>
+          <w:tcPr>
+            <w:tcW w:w="2525" w:type="dxa"/>
+          </w:tcPr>
+          <w:p>
+            <w:pPr>
+              <w:pStyle w:val="Sinespaciado"/>
+            </w:pPr>
+            <w:r>
+              <w:t>RF</w:t>
+            </w:r>
+            <w:r>
+              <w:t>017</w:t>
+            </w:r>
+          </w:p>
+        </w:tc>
+        <w:tc>
+          <w:tcPr>
+            <w:tcW w:w="2635" w:type="dxa"/>
+          </w:tcPr>
+          <w:p>
+            <w:pPr>
+              <w:pStyle w:val="Sinespaciado"/>
+              <w:rPr>
+                <w:sz w:val="24"/>
+              </w:rPr>
+            </w:pPr>
+            <w:r>
+              <w:rPr>
+                <w:rFonts w:ascii="Arial" w:eastAsia="Arial" w:hAnsi="Arial" w:cs="Arial"/>
+                <w:bCs/>
+              </w:rPr>
               <w:t>Configurar promociones de los productos</w:t>
             </w:r>
             <w:r>
@@ -1855,10 +2088,10 @@
               <w:pStyle w:val="Sinespaciado"/>
             </w:pPr>
             <w:r>
-              <w:t>RF</w:t>
-            </w:r>
-            <w:r>
-              <w:t>017</w:t>
+              <w:t>RF0</w:t>
+            </w:r>
+            <w:r>
+              <w:t>18</w:t>
             </w:r>
           </w:p>
         </w:tc>
@@ -1916,7 +2149,7 @@
               <w:t>RF0</w:t>
             </w:r>
             <w:r>
-              <w:t>18</w:t>
+              <w:t>19</w:t>
             </w:r>
           </w:p>
         </w:tc>
@@ -1971,10 +2204,7 @@
               <w:pStyle w:val="Sinespaciado"/>
             </w:pPr>
             <w:r>
-              <w:t>RF0</w:t>
-            </w:r>
-            <w:r>
-              <w:t>19</w:t>
+              <w:t>RF020</w:t>
             </w:r>
           </w:p>
         </w:tc>
@@ -2029,7 +2259,7 @@
               <w:pStyle w:val="Sinespaciado"/>
             </w:pPr>
             <w:r>
-              <w:t>RF020</w:t>
+              <w:t>RF021</w:t>
             </w:r>
           </w:p>
         </w:tc>
@@ -2099,7 +2329,7 @@
               <w:pStyle w:val="Sinespaciado"/>
             </w:pPr>
             <w:r>
-              <w:t>RF021</w:t>
+              <w:t>RF022</w:t>
             </w:r>
           </w:p>
         </w:tc>
@@ -2153,7 +2383,7 @@
               <w:pStyle w:val="Sinespaciado"/>
             </w:pPr>
             <w:r>
-              <w:t>RF022</w:t>
+              <w:t>RF023</w:t>
             </w:r>
           </w:p>
         </w:tc>
@@ -2207,7 +2437,7 @@
               <w:pStyle w:val="Sinespaciado"/>
             </w:pPr>
             <w:r>
-              <w:t>RF023</w:t>
+              <w:t>RF024</w:t>
             </w:r>
           </w:p>
         </w:tc>
@@ -2262,7 +2492,7 @@
               <w:pStyle w:val="Sinespaciado"/>
             </w:pPr>
             <w:r>
-              <w:t>RF024</w:t>
+              <w:t>RF025</w:t>
             </w:r>
           </w:p>
         </w:tc>
@@ -2316,7 +2546,7 @@
               <w:pStyle w:val="Sinespaciado"/>
             </w:pPr>
             <w:r>
-              <w:t>RF025</w:t>
+              <w:t>RF026</w:t>
             </w:r>
           </w:p>
         </w:tc>
@@ -2379,7 +2609,7 @@
               <w:pStyle w:val="Sinespaciado"/>
             </w:pPr>
             <w:r>
-              <w:t>RF026</w:t>
+              <w:t>RF027</w:t>
             </w:r>
           </w:p>
         </w:tc>
@@ -2433,7 +2663,7 @@
               <w:pStyle w:val="Sinespaciado"/>
             </w:pPr>
             <w:r>
-              <w:t>RF027</w:t>
+              <w:t>RF028</w:t>
             </w:r>
           </w:p>
         </w:tc>
@@ -2487,7 +2717,7 @@
               <w:pStyle w:val="Sinespaciado"/>
             </w:pPr>
             <w:r>
-              <w:t>RF028</w:t>
+              <w:t>RF029</w:t>
             </w:r>
           </w:p>
         </w:tc>
@@ -2541,7 +2771,7 @@
               <w:pStyle w:val="Sinespaciado"/>
             </w:pPr>
             <w:r>
-              <w:t>RF029</w:t>
+              <w:t>RF030</w:t>
             </w:r>
           </w:p>
         </w:tc>
@@ -2596,7 +2826,7 @@
               <w:pStyle w:val="Sinespaciado"/>
             </w:pPr>
             <w:r>
-              <w:t>RF030</w:t>
+              <w:t>RF031</w:t>
             </w:r>
           </w:p>
         </w:tc>
@@ -2651,7 +2881,7 @@
               <w:pStyle w:val="Sinespaciado"/>
             </w:pPr>
             <w:r>
-              <w:t>RF031</w:t>
+              <w:t>RF032</w:t>
             </w:r>
           </w:p>
         </w:tc>
@@ -2706,7 +2936,10 @@
               <w:pStyle w:val="Sinespaciado"/>
             </w:pPr>
             <w:r>
-              <w:t>RF032</w:t>
+              <w:t>RF03</w:t>
+            </w:r>
+            <w:r>
+              <w:t>3</w:t>
             </w:r>
           </w:p>
         </w:tc>
@@ -3621,6 +3854,12 @@
                 <w:sz w:val="24"/>
               </w:rPr>
             </w:pPr>
+            <w:r>
+              <w:rPr>
+                <w:sz w:val="24"/>
+              </w:rPr>
+              <w:t>Arquitectura y prototipado</w:t>
+            </w:r>
           </w:p>
         </w:tc>
         <w:tc>
@@ -3634,6 +3873,20 @@
                 <w:sz w:val="24"/>
               </w:rPr>
             </w:pPr>
+            <w:r>
+              <w:rPr>
+                <w:sz w:val="24"/>
+              </w:rPr>
+              <w:t xml:space="preserve">2 </w:t>
+            </w:r>
+            <w:proofErr w:type="gramStart"/>
+            <w:r>
+              <w:rPr>
+                <w:sz w:val="24"/>
+              </w:rPr>
+              <w:t>Semanas</w:t>
+            </w:r>
+            <w:proofErr w:type="gramEnd"/>
           </w:p>
         </w:tc>
         <w:tc>
@@ -3647,6 +3900,26 @@
                 <w:sz w:val="24"/>
               </w:rPr>
             </w:pPr>
+            <w:r>
+              <w:rPr>
+                <w:sz w:val="24"/>
+              </w:rPr>
+              <w:t>Arquitecto/</w:t>
+            </w:r>
+          </w:p>
+          <w:p>
+            <w:pPr>
+              <w:pStyle w:val="Sinespaciado"/>
+              <w:rPr>
+                <w:sz w:val="24"/>
+              </w:rPr>
+            </w:pPr>
+            <w:r>
+              <w:rPr>
+                <w:sz w:val="24"/>
+              </w:rPr>
+              <w:t>Diseñador</w:t>
+            </w:r>
           </w:p>
         </w:tc>
       </w:tr>
@@ -3681,6 +3954,12 @@
                 <w:sz w:val="24"/>
               </w:rPr>
             </w:pPr>
+            <w:r>
+              <w:rPr>
+                <w:sz w:val="24"/>
+              </w:rPr>
+              <w:t>Programación</w:t>
+            </w:r>
           </w:p>
         </w:tc>
         <w:tc>
@@ -3694,6 +3973,20 @@
                 <w:sz w:val="24"/>
               </w:rPr>
             </w:pPr>
+            <w:r>
+              <w:rPr>
+                <w:sz w:val="24"/>
+              </w:rPr>
+              <w:t xml:space="preserve">4 </w:t>
+            </w:r>
+            <w:proofErr w:type="gramStart"/>
+            <w:r>
+              <w:rPr>
+                <w:sz w:val="24"/>
+              </w:rPr>
+              <w:t>Semanas</w:t>
+            </w:r>
+            <w:proofErr w:type="gramEnd"/>
           </w:p>
         </w:tc>
         <w:tc>
@@ -3707,6 +4000,12 @@
                 <w:sz w:val="24"/>
               </w:rPr>
             </w:pPr>
+            <w:r>
+              <w:rPr>
+                <w:sz w:val="24"/>
+              </w:rPr>
+              <w:t>Equipo Desarrollo</w:t>
+            </w:r>
           </w:p>
         </w:tc>
       </w:tr>
@@ -3741,6 +4040,20 @@
                 <w:sz w:val="24"/>
               </w:rPr>
             </w:pPr>
+            <w:r>
+              <w:rPr>
+                <w:sz w:val="24"/>
+              </w:rPr>
+              <w:t xml:space="preserve">QA y </w:t>
+            </w:r>
+            <w:proofErr w:type="spellStart"/>
+            <w:r>
+              <w:rPr>
+                <w:sz w:val="24"/>
+              </w:rPr>
+              <w:t>testing</w:t>
+            </w:r>
+            <w:proofErr w:type="spellEnd"/>
           </w:p>
         </w:tc>
         <w:tc>
@@ -3754,6 +4067,20 @@
                 <w:sz w:val="24"/>
               </w:rPr>
             </w:pPr>
+            <w:r>
+              <w:rPr>
+                <w:sz w:val="24"/>
+              </w:rPr>
+              <w:t xml:space="preserve">2 </w:t>
+            </w:r>
+            <w:proofErr w:type="gramStart"/>
+            <w:r>
+              <w:rPr>
+                <w:sz w:val="24"/>
+              </w:rPr>
+              <w:t>Semanas</w:t>
+            </w:r>
+            <w:proofErr w:type="gramEnd"/>
           </w:p>
         </w:tc>
         <w:tc>
@@ -3767,6 +4094,12 @@
                 <w:sz w:val="24"/>
               </w:rPr>
             </w:pPr>
+            <w:r>
+              <w:rPr>
+                <w:sz w:val="24"/>
+              </w:rPr>
+              <w:t>Tester/QA</w:t>
+            </w:r>
           </w:p>
         </w:tc>
       </w:tr>
@@ -3801,6 +4134,12 @@
                 <w:sz w:val="24"/>
               </w:rPr>
             </w:pPr>
+            <w:r>
+              <w:rPr>
+                <w:sz w:val="24"/>
+              </w:rPr>
+              <w:t>Puesta en producción</w:t>
+            </w:r>
           </w:p>
         </w:tc>
         <w:tc>
@@ -3814,6 +4153,20 @@
                 <w:sz w:val="24"/>
               </w:rPr>
             </w:pPr>
+            <w:r>
+              <w:rPr>
+                <w:sz w:val="24"/>
+              </w:rPr>
+              <w:t xml:space="preserve">1 </w:t>
+            </w:r>
+            <w:proofErr w:type="gramStart"/>
+            <w:r>
+              <w:rPr>
+                <w:sz w:val="24"/>
+              </w:rPr>
+              <w:t>Semana</w:t>
+            </w:r>
+            <w:proofErr w:type="gramEnd"/>
           </w:p>
         </w:tc>
         <w:tc>
@@ -3827,6 +4180,12 @@
                 <w:sz w:val="24"/>
               </w:rPr>
             </w:pPr>
+            <w:r>
+              <w:rPr>
+                <w:sz w:val="24"/>
+              </w:rPr>
+              <w:t>Líder Técnico</w:t>
+            </w:r>
           </w:p>
         </w:tc>
       </w:tr>
@@ -3880,7 +4239,7 @@
           <w:u w:val="single"/>
         </w:rPr>
       </w:pPr>
-      <w:hyperlink r:id="rId7" w:history="1">
+      <w:hyperlink r:id="rId8" w:history="1">
         <w:r>
           <w:rPr>
             <w:rStyle w:val="Hipervnculo"/>
@@ -3934,6 +4293,38 @@
     <w:p>
       <w:pPr>
         <w:pStyle w:val="Sinespaciado"/>
+        <w:ind w:left="720"/>
+        <w:rPr>
+          <w:rStyle w:val="Hipervnculo"/>
+          <w:sz w:val="24"/>
+          <w:szCs w:val="24"/>
+        </w:rPr>
+      </w:pPr>
+      <w:hyperlink r:id="rId9" w:history="1">
+        <w:r>
+          <w:rPr>
+            <w:rStyle w:val="Hipervnculo"/>
+            <w:sz w:val="24"/>
+            <w:szCs w:val="24"/>
+          </w:rPr>
+          <w:t>https://docs.google.com/spreadsheets/d/1Hp_mLhCEBgqtfFRPlIcuQNST8jooyhp1/edit?usp=sharing&amp;ouid=110984401584463252056&amp;rtpof=true&amp;sd=true</w:t>
+        </w:r>
+      </w:hyperlink>
+    </w:p>
+    <w:p>
+      <w:pPr>
+        <w:pStyle w:val="Sinespaciado"/>
+        <w:ind w:left="720"/>
+        <w:rPr>
+          <w:rStyle w:val="Hipervnculo"/>
+          <w:sz w:val="24"/>
+          <w:szCs w:val="24"/>
+        </w:rPr>
+      </w:pPr>
+    </w:p>
+    <w:p>
+      <w:pPr>
+        <w:pStyle w:val="Sinespaciado"/>
         <w:numPr>
           <w:ilvl w:val="0"/>
           <w:numId w:val="1"/>
@@ -3950,7 +4341,25 @@
           <w:sz w:val="24"/>
           <w:u w:val="single"/>
         </w:rPr>
-        <w:t>Gestión de Requisitos(REQM)</w:t>
+        <w:t xml:space="preserve">Gestión de </w:t>
+      </w:r>
+      <w:proofErr w:type="gramStart"/>
+      <w:r>
+        <w:rPr>
+          <w:b/>
+          <w:sz w:val="24"/>
+          <w:u w:val="single"/>
+        </w:rPr>
+        <w:t>Requisitos(</w:t>
+      </w:r>
+      <w:proofErr w:type="gramEnd"/>
+      <w:r>
+        <w:rPr>
+          <w:b/>
+          <w:sz w:val="24"/>
+          <w:u w:val="single"/>
+        </w:rPr>
+        <w:t>REQM)</w:t>
       </w:r>
     </w:p>
     <w:p>
@@ -3981,8 +4390,22 @@
         <w:rPr>
           <w:sz w:val="24"/>
         </w:rPr>
-        <w:t>Requisitos Documentos en Jira</w:t>
-      </w:r>
+        <w:t>Requisitos Documentos en</w:t>
+      </w:r>
+      <w:r>
+        <w:rPr>
+          <w:sz w:val="24"/>
+        </w:rPr>
+        <w:t xml:space="preserve"> </w:t>
+      </w:r>
+      <w:proofErr w:type="spellStart"/>
+      <w:r>
+        <w:rPr>
+          <w:sz w:val="24"/>
+        </w:rPr>
+        <w:t>Notion</w:t>
+      </w:r>
+      <w:proofErr w:type="spellEnd"/>
     </w:p>
     <w:p>
       <w:pPr>
@@ -4098,7 +4521,7 @@
           <w:u w:val="single"/>
         </w:rPr>
       </w:pPr>
-      <w:hyperlink r:id="rId8" w:history="1">
+      <w:hyperlink r:id="rId10" w:history="1">
         <w:r>
           <w:rPr>
             <w:rStyle w:val="Hipervnculo"/>
@@ -4181,13 +4604,52 @@
           <w:b/>
           <w:sz w:val="24"/>
           <w:u w:val="single"/>
-        </w:rPr>
-      </w:pPr>
-      <w:r>
-        <w:rPr>
-          <w:sz w:val="24"/>
-        </w:rPr>
-        <w:t>Ramas: Main, develop, feature</w:t>
+          <w:lang w:val="en-US"/>
+        </w:rPr>
+      </w:pPr>
+      <w:r>
+        <w:rPr>
+          <w:sz w:val="24"/>
+          <w:lang w:val="en-US"/>
+        </w:rPr>
+        <w:t xml:space="preserve">Ramas: </w:t>
+      </w:r>
+      <w:proofErr w:type="spellStart"/>
+      <w:r>
+        <w:rPr>
+          <w:sz w:val="24"/>
+          <w:lang w:val="en-US"/>
+        </w:rPr>
+        <w:t>Produccion</w:t>
+      </w:r>
+      <w:proofErr w:type="spellEnd"/>
+      <w:r>
+        <w:rPr>
+          <w:sz w:val="24"/>
+          <w:lang w:val="en-US"/>
+        </w:rPr>
+        <w:t>, Test, Daniel</w:t>
+      </w:r>
+      <w:r>
+        <w:rPr>
+          <w:sz w:val="24"/>
+          <w:lang w:val="en-US"/>
+        </w:rPr>
+        <w:t>a</w:t>
+      </w:r>
+      <w:r>
+        <w:rPr>
+          <w:sz w:val="24"/>
+          <w:lang w:val="en-US"/>
+        </w:rPr>
+        <w:t xml:space="preserve">, </w:t>
+      </w:r>
+      <w:r>
+        <w:rPr>
+          <w:sz w:val="24"/>
+          <w:lang w:val="en-US"/>
+        </w:rPr>
+        <w:t>Jhonatan, Katherin</w:t>
       </w:r>
     </w:p>
     <w:p>
@@ -4203,11 +4665,19 @@
           <w:u w:val="single"/>
         </w:rPr>
       </w:pPr>
-      <w:r>
-        <w:rPr>
-          <w:sz w:val="24"/>
-        </w:rPr>
-        <w:t>Baselines por sprint</w:t>
+      <w:proofErr w:type="spellStart"/>
+      <w:r>
+        <w:rPr>
+          <w:sz w:val="24"/>
+        </w:rPr>
+        <w:t>Baselines</w:t>
+      </w:r>
+      <w:proofErr w:type="spellEnd"/>
+      <w:r>
+        <w:rPr>
+          <w:sz w:val="24"/>
+        </w:rPr>
+        <w:t xml:space="preserve"> por sprint</w:t>
       </w:r>
     </w:p>
     <w:p>
@@ -4223,19 +4693,23 @@
           <w:u w:val="single"/>
         </w:rPr>
       </w:pPr>
-      <w:proofErr w:type="spellStart"/>
-      <w:r>
-        <w:rPr>
-          <w:sz w:val="24"/>
-        </w:rPr>
-        <w:t>Contol</w:t>
-      </w:r>
-      <w:proofErr w:type="spellEnd"/>
-      <w:r>
-        <w:rPr>
-          <w:sz w:val="24"/>
-        </w:rPr>
-        <w:t xml:space="preserve"> de cambios </w:t>
+      <w:r>
+        <w:rPr>
+          <w:sz w:val="24"/>
+        </w:rPr>
+        <w:t>Cont</w:t>
+      </w:r>
+      <w:r>
+        <w:rPr>
+          <w:sz w:val="24"/>
+        </w:rPr>
+        <w:t>r</w:t>
+      </w:r>
+      <w:r>
+        <w:rPr>
+          <w:sz w:val="24"/>
+        </w:rPr>
+        <w:t xml:space="preserve">ol de cambios </w:t>
       </w:r>
       <w:proofErr w:type="spellStart"/>
       <w:r>
@@ -4344,9 +4818,9 @@
         <w:tblLook w:val="04A0" w:firstRow="1" w:lastRow="0" w:firstColumn="1" w:lastColumn="0" w:noHBand="0" w:noVBand="1"/>
       </w:tblPr>
       <w:tblGrid>
-        <w:gridCol w:w="2601"/>
-        <w:gridCol w:w="2589"/>
-        <w:gridCol w:w="2918"/>
+        <w:gridCol w:w="2702"/>
+        <w:gridCol w:w="2703"/>
+        <w:gridCol w:w="2703"/>
       </w:tblGrid>
       <w:tr>
         <w:tc>
@@ -4472,22 +4946,20 @@
                 <w:sz w:val="24"/>
               </w:rPr>
             </w:pPr>
-            <w:proofErr w:type="spellStart"/>
+            <w:r>
+              <w:rPr>
+                <w:sz w:val="24"/>
+              </w:rPr>
+              <w:t xml:space="preserve">Equipo de desarrollo, Scrum </w:t>
+            </w:r>
             <w:proofErr w:type="gramStart"/>
             <w:r>
               <w:rPr>
                 <w:sz w:val="24"/>
               </w:rPr>
-              <w:t>Daniela,Jhonathan</w:t>
+              <w:t>Master</w:t>
             </w:r>
             <w:proofErr w:type="gramEnd"/>
-            <w:r>
-              <w:rPr>
-                <w:sz w:val="24"/>
-              </w:rPr>
-              <w:t>,Katherin</w:t>
-            </w:r>
-            <w:proofErr w:type="spellEnd"/>
           </w:p>
         </w:tc>
       </w:tr>
@@ -4542,21 +5014,41 @@
               </w:rPr>
             </w:pPr>
             <w:proofErr w:type="spellStart"/>
+            <w:r>
+              <w:rPr>
+                <w:sz w:val="24"/>
+              </w:rPr>
+              <w:t>Product</w:t>
+            </w:r>
+            <w:proofErr w:type="spellEnd"/>
+            <w:r>
+              <w:rPr>
+                <w:sz w:val="24"/>
+              </w:rPr>
+              <w:t xml:space="preserve"> Owner, Equipo de </w:t>
+            </w:r>
+            <w:proofErr w:type="spellStart"/>
+            <w:r>
+              <w:rPr>
+                <w:sz w:val="24"/>
+              </w:rPr>
+              <w:t>Devs</w:t>
+            </w:r>
+            <w:proofErr w:type="spellEnd"/>
+            <w:r>
+              <w:rPr>
+                <w:sz w:val="24"/>
+              </w:rPr>
+              <w:t xml:space="preserve">, Scrum </w:t>
+            </w:r>
             <w:proofErr w:type="gramStart"/>
             <w:r>
               <w:rPr>
                 <w:sz w:val="24"/>
               </w:rPr>
-              <w:t>Daniela,Jhonathan</w:t>
+              <w:t>Master</w:t>
             </w:r>
             <w:proofErr w:type="gramEnd"/>
-            <w:r>
-              <w:rPr>
-                <w:sz w:val="24"/>
-              </w:rPr>
-              <w:t>,Katherin</w:t>
-            </w:r>
-            <w:proofErr w:type="spellEnd"/>
           </w:p>
         </w:tc>
       </w:tr>
@@ -4610,20 +5102,18 @@
                 <w:sz w:val="24"/>
               </w:rPr>
             </w:pPr>
+            <w:r>
+              <w:rPr>
+                <w:sz w:val="24"/>
+              </w:rPr>
+              <w:t xml:space="preserve">Project Manager, </w:t>
+            </w:r>
             <w:proofErr w:type="spellStart"/>
-            <w:proofErr w:type="gramStart"/>
-            <w:r>
-              <w:rPr>
-                <w:sz w:val="24"/>
-              </w:rPr>
-              <w:t>Daniela,Jhonathan</w:t>
-            </w:r>
-            <w:proofErr w:type="gramEnd"/>
-            <w:r>
-              <w:rPr>
-                <w:sz w:val="24"/>
-              </w:rPr>
-              <w:t>,Katherin</w:t>
+            <w:r>
+              <w:rPr>
+                <w:sz w:val="24"/>
+              </w:rPr>
+              <w:t>Stakeholders</w:t>
             </w:r>
             <w:proofErr w:type="spellEnd"/>
           </w:p>
@@ -4677,22 +5167,46 @@
               <w:pStyle w:val="Sinespaciado"/>
               <w:rPr>
                 <w:sz w:val="24"/>
-              </w:rPr>
-            </w:pPr>
+                <w:lang w:val="en-US"/>
+              </w:rPr>
+            </w:pPr>
+            <w:r>
+              <w:rPr>
+                <w:sz w:val="24"/>
+                <w:lang w:val="en-US"/>
+              </w:rPr>
+              <w:t xml:space="preserve">Project Manager, </w:t>
+            </w:r>
             <w:proofErr w:type="spellStart"/>
-            <w:proofErr w:type="gramStart"/>
-            <w:r>
-              <w:rPr>
-                <w:sz w:val="24"/>
-              </w:rPr>
-              <w:t>Daniela,Jhonathan</w:t>
-            </w:r>
-            <w:proofErr w:type="gramEnd"/>
-            <w:r>
-              <w:rPr>
-                <w:sz w:val="24"/>
-              </w:rPr>
-              <w:t>,Katherin</w:t>
+            <w:r>
+              <w:rPr>
+                <w:sz w:val="24"/>
+                <w:lang w:val="en-US"/>
+              </w:rPr>
+              <w:t>Comité</w:t>
+            </w:r>
+            <w:proofErr w:type="spellEnd"/>
+            <w:r>
+              <w:rPr>
+                <w:sz w:val="24"/>
+                <w:lang w:val="en-US"/>
+              </w:rPr>
+              <w:t xml:space="preserve"> de </w:t>
+            </w:r>
+            <w:proofErr w:type="spellStart"/>
+            <w:r>
+              <w:rPr>
+                <w:sz w:val="24"/>
+                <w:lang w:val="en-US"/>
+              </w:rPr>
+              <w:t>F</w:t>
+            </w:r>
+            <w:r>
+              <w:rPr>
+                <w:sz w:val="24"/>
+                <w:lang w:val="en-US"/>
+              </w:rPr>
+              <w:t>inanzas</w:t>
             </w:r>
             <w:proofErr w:type="spellEnd"/>
           </w:p>
@@ -4707,6 +5221,7 @@
           <w:b/>
           <w:sz w:val="24"/>
           <w:u w:val="single"/>
+          <w:lang w:val="en-US"/>
         </w:rPr>
       </w:pPr>
     </w:p>
@@ -4759,7 +5274,7 @@
       <w:tr>
         <w:tc>
           <w:tcPr>
-            <w:tcW w:w="2207" w:type="dxa"/>
+            <w:tcW w:w="2026" w:type="dxa"/>
             <w:shd w:val="clear" w:color="auto" w:fill="A5A5A5" w:themeFill="accent3"/>
           </w:tcPr>
           <w:p>
@@ -4781,7 +5296,7 @@
         </w:tc>
         <w:tc>
           <w:tcPr>
-            <w:tcW w:w="2207" w:type="dxa"/>
+            <w:tcW w:w="1983" w:type="dxa"/>
             <w:shd w:val="clear" w:color="auto" w:fill="A5A5A5" w:themeFill="accent3"/>
           </w:tcPr>
           <w:p>
@@ -4803,7 +5318,7 @@
         </w:tc>
         <w:tc>
           <w:tcPr>
-            <w:tcW w:w="2207" w:type="dxa"/>
+            <w:tcW w:w="2070" w:type="dxa"/>
             <w:shd w:val="clear" w:color="auto" w:fill="A5A5A5" w:themeFill="accent3"/>
           </w:tcPr>
           <w:p>
@@ -4825,7 +5340,7 @@
         </w:tc>
         <w:tc>
           <w:tcPr>
-            <w:tcW w:w="2207" w:type="dxa"/>
+            <w:tcW w:w="2029" w:type="dxa"/>
             <w:shd w:val="clear" w:color="auto" w:fill="A5A5A5" w:themeFill="accent3"/>
           </w:tcPr>
           <w:p>
@@ -4849,7 +5364,7 @@
       <w:tr>
         <w:tc>
           <w:tcPr>
-            <w:tcW w:w="2207" w:type="dxa"/>
+            <w:tcW w:w="2026" w:type="dxa"/>
           </w:tcPr>
           <w:p>
             <w:pPr>
@@ -4868,7 +5383,7 @@
         </w:tc>
         <w:tc>
           <w:tcPr>
-            <w:tcW w:w="2207" w:type="dxa"/>
+            <w:tcW w:w="1983" w:type="dxa"/>
           </w:tcPr>
           <w:p>
             <w:pPr>
@@ -4887,7 +5402,7 @@
         </w:tc>
         <w:tc>
           <w:tcPr>
-            <w:tcW w:w="2207" w:type="dxa"/>
+            <w:tcW w:w="2070" w:type="dxa"/>
           </w:tcPr>
           <w:p>
             <w:pPr>
@@ -4906,7 +5421,7 @@
         </w:tc>
         <w:tc>
           <w:tcPr>
-            <w:tcW w:w="2207" w:type="dxa"/>
+            <w:tcW w:w="2029" w:type="dxa"/>
           </w:tcPr>
           <w:p>
             <w:pPr>
@@ -4927,7 +5442,7 @@
       <w:tr>
         <w:tc>
           <w:tcPr>
-            <w:tcW w:w="2207" w:type="dxa"/>
+            <w:tcW w:w="2026" w:type="dxa"/>
           </w:tcPr>
           <w:p>
             <w:pPr>
@@ -4946,7 +5461,7 @@
         </w:tc>
         <w:tc>
           <w:tcPr>
-            <w:tcW w:w="2207" w:type="dxa"/>
+            <w:tcW w:w="1983" w:type="dxa"/>
           </w:tcPr>
           <w:p>
             <w:pPr>
@@ -4965,7 +5480,7 @@
         </w:tc>
         <w:tc>
           <w:tcPr>
-            <w:tcW w:w="2207" w:type="dxa"/>
+            <w:tcW w:w="2070" w:type="dxa"/>
           </w:tcPr>
           <w:p>
             <w:pPr>
@@ -4984,20 +5499,276 @@
         </w:tc>
         <w:tc>
           <w:tcPr>
-            <w:tcW w:w="2207" w:type="dxa"/>
-          </w:tcPr>
-          <w:p>
-            <w:pPr>
-              <w:pStyle w:val="Sinespaciado"/>
-              <w:rPr>
-                <w:sz w:val="24"/>
-              </w:rPr>
-            </w:pPr>
-            <w:r>
-              <w:rPr>
-                <w:sz w:val="24"/>
-              </w:rPr>
-              <w:t>Control de Cambios</w:t>
+            <w:tcW w:w="2029" w:type="dxa"/>
+          </w:tcPr>
+          <w:p>
+            <w:pPr>
+              <w:pStyle w:val="Sinespaciado"/>
+              <w:rPr>
+                <w:sz w:val="24"/>
+              </w:rPr>
+            </w:pPr>
+            <w:r>
+              <w:rPr>
+                <w:sz w:val="24"/>
+              </w:rPr>
+              <w:t>Comité de Control de Cambios (CCC)</w:t>
+            </w:r>
+          </w:p>
+        </w:tc>
+      </w:tr>
+      <w:tr>
+        <w:tc>
+          <w:tcPr>
+            <w:tcW w:w="2026" w:type="dxa"/>
+          </w:tcPr>
+          <w:p>
+            <w:pPr>
+              <w:pStyle w:val="Sinespaciado"/>
+              <w:rPr>
+                <w:sz w:val="24"/>
+              </w:rPr>
+            </w:pPr>
+            <w:r>
+              <w:rPr>
+                <w:sz w:val="24"/>
+              </w:rPr>
+              <w:t xml:space="preserve">Incompatibilidad de </w:t>
+            </w:r>
+            <w:proofErr w:type="spellStart"/>
+            <w:r>
+              <w:rPr>
+                <w:sz w:val="24"/>
+              </w:rPr>
+              <w:t>APIs</w:t>
+            </w:r>
+            <w:proofErr w:type="spellEnd"/>
+          </w:p>
+        </w:tc>
+        <w:tc>
+          <w:tcPr>
+            <w:tcW w:w="1983" w:type="dxa"/>
+          </w:tcPr>
+          <w:p>
+            <w:pPr>
+              <w:pStyle w:val="Sinespaciado"/>
+              <w:rPr>
+                <w:sz w:val="24"/>
+              </w:rPr>
+            </w:pPr>
+            <w:r>
+              <w:rPr>
+                <w:sz w:val="24"/>
+              </w:rPr>
+              <w:t>Medio</w:t>
+            </w:r>
+          </w:p>
+        </w:tc>
+        <w:tc>
+          <w:tcPr>
+            <w:tcW w:w="2070" w:type="dxa"/>
+          </w:tcPr>
+          <w:p>
+            <w:pPr>
+              <w:pStyle w:val="Sinespaciado"/>
+              <w:rPr>
+                <w:sz w:val="24"/>
+              </w:rPr>
+            </w:pPr>
+            <w:r>
+              <w:rPr>
+                <w:sz w:val="24"/>
+              </w:rPr>
+              <w:t>Media</w:t>
+            </w:r>
+          </w:p>
+        </w:tc>
+        <w:tc>
+          <w:tcPr>
+            <w:tcW w:w="2029" w:type="dxa"/>
+          </w:tcPr>
+          <w:p>
+            <w:pPr>
+              <w:pStyle w:val="Sinespaciado"/>
+              <w:rPr>
+                <w:sz w:val="24"/>
+              </w:rPr>
+            </w:pPr>
+            <w:r>
+              <w:rPr>
+                <w:sz w:val="24"/>
+              </w:rPr>
+              <w:t>Tener una versión LTS y realizar pruebas</w:t>
+            </w:r>
+          </w:p>
+        </w:tc>
+      </w:tr>
+      <w:tr>
+        <w:tc>
+          <w:tcPr>
+            <w:tcW w:w="2026" w:type="dxa"/>
+          </w:tcPr>
+          <w:p>
+            <w:pPr>
+              <w:pStyle w:val="Sinespaciado"/>
+              <w:rPr>
+                <w:sz w:val="24"/>
+              </w:rPr>
+            </w:pPr>
+            <w:r>
+              <w:rPr>
+                <w:sz w:val="24"/>
+              </w:rPr>
+              <w:t>Fallos de infraestructura</w:t>
+            </w:r>
+          </w:p>
+        </w:tc>
+        <w:tc>
+          <w:tcPr>
+            <w:tcW w:w="1983" w:type="dxa"/>
+          </w:tcPr>
+          <w:p>
+            <w:pPr>
+              <w:pStyle w:val="Sinespaciado"/>
+              <w:rPr>
+                <w:sz w:val="24"/>
+              </w:rPr>
+            </w:pPr>
+            <w:r>
+              <w:rPr>
+                <w:sz w:val="24"/>
+              </w:rPr>
+              <w:t>Alto</w:t>
+            </w:r>
+          </w:p>
+        </w:tc>
+        <w:tc>
+          <w:tcPr>
+            <w:tcW w:w="2070" w:type="dxa"/>
+          </w:tcPr>
+          <w:p>
+            <w:pPr>
+              <w:pStyle w:val="Sinespaciado"/>
+              <w:rPr>
+                <w:sz w:val="24"/>
+              </w:rPr>
+            </w:pPr>
+            <w:r>
+              <w:rPr>
+                <w:sz w:val="24"/>
+              </w:rPr>
+              <w:t>Baja</w:t>
+            </w:r>
+          </w:p>
+        </w:tc>
+        <w:tc>
+          <w:tcPr>
+            <w:tcW w:w="2029" w:type="dxa"/>
+          </w:tcPr>
+          <w:p>
+            <w:pPr>
+              <w:pStyle w:val="Sinespaciado"/>
+              <w:rPr>
+                <w:sz w:val="24"/>
+              </w:rPr>
+            </w:pPr>
+            <w:r>
+              <w:rPr>
+                <w:sz w:val="24"/>
+              </w:rPr>
+              <w:t xml:space="preserve">Realizar </w:t>
+            </w:r>
+            <w:proofErr w:type="spellStart"/>
+            <w:r>
+              <w:rPr>
+                <w:sz w:val="24"/>
+              </w:rPr>
+              <w:t>Backups</w:t>
+            </w:r>
+            <w:proofErr w:type="spellEnd"/>
+            <w:r>
+              <w:rPr>
+                <w:sz w:val="24"/>
+              </w:rPr>
+              <w:t xml:space="preserve"> automatizados</w:t>
+            </w:r>
+          </w:p>
+        </w:tc>
+      </w:tr>
+      <w:tr>
+        <w:tc>
+          <w:tcPr>
+            <w:tcW w:w="2026" w:type="dxa"/>
+          </w:tcPr>
+          <w:p>
+            <w:pPr>
+              <w:pStyle w:val="Sinespaciado"/>
+              <w:rPr>
+                <w:sz w:val="24"/>
+              </w:rPr>
+            </w:pPr>
+            <w:r>
+              <w:rPr>
+                <w:sz w:val="24"/>
+              </w:rPr>
+              <w:t>Cambio de personal</w:t>
+            </w:r>
+          </w:p>
+        </w:tc>
+        <w:tc>
+          <w:tcPr>
+            <w:tcW w:w="1983" w:type="dxa"/>
+          </w:tcPr>
+          <w:p>
+            <w:pPr>
+              <w:pStyle w:val="Sinespaciado"/>
+              <w:rPr>
+                <w:sz w:val="24"/>
+              </w:rPr>
+            </w:pPr>
+            <w:r>
+              <w:rPr>
+                <w:sz w:val="24"/>
+              </w:rPr>
+              <w:t>Alto</w:t>
+            </w:r>
+          </w:p>
+        </w:tc>
+        <w:tc>
+          <w:tcPr>
+            <w:tcW w:w="2070" w:type="dxa"/>
+          </w:tcPr>
+          <w:p>
+            <w:pPr>
+              <w:pStyle w:val="Sinespaciado"/>
+              <w:rPr>
+                <w:sz w:val="24"/>
+              </w:rPr>
+            </w:pPr>
+            <w:r>
+              <w:rPr>
+                <w:sz w:val="24"/>
+              </w:rPr>
+              <w:t>Media</w:t>
+            </w:r>
+          </w:p>
+        </w:tc>
+        <w:tc>
+          <w:tcPr>
+            <w:tcW w:w="2029" w:type="dxa"/>
+          </w:tcPr>
+          <w:p>
+            <w:pPr>
+              <w:pStyle w:val="Sinespaciado"/>
+              <w:rPr>
+                <w:sz w:val="24"/>
+              </w:rPr>
+            </w:pPr>
+            <w:r>
+              <w:rPr>
+                <w:sz w:val="24"/>
+              </w:rPr>
+              <w:t>Tener documentación clara y explicita</w:t>
             </w:r>
           </w:p>
         </w:tc>
@@ -5317,6 +6088,20 @@
                 <w:sz w:val="24"/>
               </w:rPr>
             </w:pPr>
+            <w:r>
+              <w:rPr>
+                <w:sz w:val="24"/>
+              </w:rPr>
+              <w:t xml:space="preserve">Avance del </w:t>
+            </w:r>
+            <w:proofErr w:type="spellStart"/>
+            <w:r>
+              <w:rPr>
+                <w:sz w:val="24"/>
+              </w:rPr>
+              <w:t>codigo</w:t>
+            </w:r>
+            <w:proofErr w:type="spellEnd"/>
           </w:p>
         </w:tc>
         <w:tc>
@@ -5330,6 +6115,12 @@
                 <w:sz w:val="24"/>
               </w:rPr>
             </w:pPr>
+            <w:r>
+              <w:rPr>
+                <w:sz w:val="24"/>
+              </w:rPr>
+              <w:t>Tener un porcentaje de código probado por los Tester</w:t>
+            </w:r>
           </w:p>
         </w:tc>
         <w:tc>
@@ -5343,6 +6134,12 @@
                 <w:sz w:val="24"/>
               </w:rPr>
             </w:pPr>
+            <w:r>
+              <w:rPr>
+                <w:sz w:val="24"/>
+              </w:rPr>
+              <w:t>Quincenal</w:t>
+            </w:r>
           </w:p>
         </w:tc>
       </w:tr>
@@ -5358,6 +6155,12 @@
                 <w:sz w:val="24"/>
               </w:rPr>
             </w:pPr>
+            <w:r>
+              <w:rPr>
+                <w:sz w:val="24"/>
+              </w:rPr>
+              <w:t>Estabilidad</w:t>
+            </w:r>
           </w:p>
         </w:tc>
         <w:tc>
@@ -5371,6 +6174,26 @@
                 <w:sz w:val="24"/>
               </w:rPr>
             </w:pPr>
+            <w:r>
+              <w:rPr>
+                <w:sz w:val="24"/>
+              </w:rPr>
+              <w:t xml:space="preserve">Medir el </w:t>
+            </w:r>
+            <w:proofErr w:type="spellStart"/>
+            <w:r>
+              <w:rPr>
+                <w:sz w:val="24"/>
+              </w:rPr>
+              <w:t>trafico</w:t>
+            </w:r>
+            <w:proofErr w:type="spellEnd"/>
+            <w:r>
+              <w:rPr>
+                <w:sz w:val="24"/>
+              </w:rPr>
+              <w:t xml:space="preserve"> del sistema</w:t>
+            </w:r>
           </w:p>
         </w:tc>
         <w:tc>
@@ -5384,6 +6207,12 @@
                 <w:sz w:val="24"/>
               </w:rPr>
             </w:pPr>
+            <w:r>
+              <w:rPr>
+                <w:sz w:val="24"/>
+              </w:rPr>
+              <w:t>Semanal</w:t>
+            </w:r>
           </w:p>
         </w:tc>
       </w:tr>
@@ -5849,6 +6678,12 @@
                 <w:sz w:val="24"/>
               </w:rPr>
             </w:pPr>
+            <w:r>
+              <w:rPr>
+                <w:sz w:val="24"/>
+              </w:rPr>
+              <w:t>26/03/2026</w:t>
+            </w:r>
           </w:p>
         </w:tc>
         <w:tc>
@@ -5866,7 +6701,7 @@
               <w:rPr>
                 <w:sz w:val="24"/>
               </w:rPr>
-              <w:t>Katherin Morcillo Quiroga</w:t>
+              <w:t>Analista</w:t>
             </w:r>
           </w:p>
         </w:tc>
@@ -5902,6 +6737,12 @@
                 <w:sz w:val="24"/>
               </w:rPr>
             </w:pPr>
+            <w:r>
+              <w:rPr>
+                <w:sz w:val="24"/>
+              </w:rPr>
+              <w:t>26/03/2026</w:t>
+            </w:r>
           </w:p>
         </w:tc>
         <w:tc>
@@ -5915,6 +6756,12 @@
                 <w:sz w:val="24"/>
               </w:rPr>
             </w:pPr>
+            <w:r>
+              <w:rPr>
+                <w:sz w:val="24"/>
+              </w:rPr>
+              <w:t>Arquitecto de Software</w:t>
+            </w:r>
           </w:p>
         </w:tc>
       </w:tr>
@@ -5949,6 +6796,12 @@
                 <w:sz w:val="24"/>
               </w:rPr>
             </w:pPr>
+            <w:r>
+              <w:rPr>
+                <w:sz w:val="24"/>
+              </w:rPr>
+              <w:t>26/03/2026</w:t>
+            </w:r>
           </w:p>
         </w:tc>
         <w:tc>
@@ -5962,6 +6815,12 @@
                 <w:sz w:val="24"/>
               </w:rPr>
             </w:pPr>
+            <w:r>
+              <w:rPr>
+                <w:sz w:val="24"/>
+              </w:rPr>
+              <w:t>Diseñador UI/UX</w:t>
+            </w:r>
           </w:p>
         </w:tc>
       </w:tr>
@@ -5996,6 +6855,12 @@
                 <w:sz w:val="24"/>
               </w:rPr>
             </w:pPr>
+            <w:r>
+              <w:rPr>
+                <w:sz w:val="24"/>
+              </w:rPr>
+              <w:t>26/03/2026</w:t>
+            </w:r>
           </w:p>
         </w:tc>
         <w:tc>
@@ -6009,6 +6874,12 @@
                 <w:sz w:val="24"/>
               </w:rPr>
             </w:pPr>
+            <w:r>
+              <w:rPr>
+                <w:sz w:val="24"/>
+              </w:rPr>
+              <w:t>Equipo de desarrollo</w:t>
+            </w:r>
           </w:p>
         </w:tc>
       </w:tr>
@@ -6043,6 +6914,12 @@
                 <w:sz w:val="24"/>
               </w:rPr>
             </w:pPr>
+            <w:r>
+              <w:rPr>
+                <w:sz w:val="24"/>
+              </w:rPr>
+              <w:t>26/03/2026</w:t>
+            </w:r>
           </w:p>
         </w:tc>
         <w:tc>
@@ -6056,6 +6933,28 @@
                 <w:sz w:val="24"/>
               </w:rPr>
             </w:pPr>
+            <w:proofErr w:type="spellStart"/>
+            <w:r>
+              <w:rPr>
+                <w:sz w:val="24"/>
+              </w:rPr>
+              <w:t>Lider</w:t>
+            </w:r>
+            <w:proofErr w:type="spellEnd"/>
+            <w:r>
+              <w:rPr>
+                <w:sz w:val="24"/>
+              </w:rPr>
+              <w:t xml:space="preserve"> </w:t>
+            </w:r>
+            <w:proofErr w:type="spellStart"/>
+            <w:r>
+              <w:rPr>
+                <w:sz w:val="24"/>
+              </w:rPr>
+              <w:t>Tecnico</w:t>
+            </w:r>
+            <w:proofErr w:type="spellEnd"/>
           </w:p>
         </w:tc>
       </w:tr>
@@ -6090,6 +6989,12 @@
                 <w:sz w:val="24"/>
               </w:rPr>
             </w:pPr>
+            <w:r>
+              <w:rPr>
+                <w:sz w:val="24"/>
+              </w:rPr>
+              <w:t>26/03/2026</w:t>
+            </w:r>
           </w:p>
         </w:tc>
         <w:tc>
@@ -6103,6 +7008,12 @@
                 <w:sz w:val="24"/>
               </w:rPr>
             </w:pPr>
+            <w:r>
+              <w:rPr>
+                <w:sz w:val="24"/>
+              </w:rPr>
+              <w:t>Analista</w:t>
+            </w:r>
           </w:p>
         </w:tc>
       </w:tr>
@@ -6214,6 +7125,304 @@
 <file path=word/numbering.xml><?xml version="1.0" encoding="utf-8"?>
 <w:numbering xmlns:wpc="http://schemas.microsoft.com/office/word/2010/wordprocessingCanvas" xmlns:cx="http://schemas.microsoft.com/office/drawing/2014/chartex" xmlns:cx1="http://schemas.microsoft.com/office/drawing/2015/9/8/chartex" xmlns:cx2="http://schemas.microsoft.com/office/drawing/2015/10/21/chartex" xmlns:cx3="http://schemas.microsoft.com/office/drawing/2016/5/9/chartex" xmlns:cx4="http://schemas.microsoft.com/office/drawing/2016/5/10/chartex" xmlns:cx5="http://schemas.microsoft.com/office/drawing/2016/5/11/chartex" xmlns:cx6="http://schemas.microsoft.com/office/drawing/2016/5/12/chartex" xmlns:cx7="http://schemas.microsoft.com/office/drawing/2016/5/13/chartex" xmlns:cx8="http://schemas.microsoft.com/office/drawing/2016/5/14/chartex" xmlns:mc="http://schemas.openxmlformats.org/markup-compatibility/2006" xmlns:aink="http://schemas.microsoft.com/office/drawing/2016/ink" xmlns:am3d="http://schemas.microsoft.com/office/drawing/2017/model3d" xmlns:o="urn:schemas-microsoft-com:office:office" xmlns:oel="http://schemas.microsoft.com/office/2019/extlst" xmlns:r="http://schemas.openxmlformats.org/officeDocument/2006/relationships" xmlns:m="http://schemas.openxmlformats.org/officeDocument/2006/math" xmlns:v="urn:schemas-microsoft-com:vml" xmlns:wp14="http://schemas.microsoft.com/office/word/2010/wordprocessingDrawing" xmlns:wp="http://schemas.openxmlformats.org/drawingml/2006/wordprocessingDrawing" xmlns:w10="urn:schemas-microsoft-com:office:word" xmlns:w="http://schemas.openxmlformats.org/wordprocessingml/2006/main" xmlns:w14="http://schemas.microsoft.com/office/word/2010/wordml" xmlns:w15="http://schemas.microsoft.com/office/word/2012/wordml" xmlns:w16cex="http://schemas.microsoft.com/office/word/2018/wordml/cex" xmlns:w16cid="http://schemas.microsoft.com/office/word/2016/wordml/cid" xmlns:w16="http://schemas.microsoft.com/office/word/2018/wordml" xmlns:w16du="http://schemas.microsoft.com/office/word/2023/wordml/word16du" xmlns:w16sdtdh="http://schemas.microsoft.com/office/word/2020/wordml/sdtdatahash" xmlns:w16sdtfl="http://schemas.microsoft.com/office/word/2024/wordml/sdtformatlock" xmlns:w16se="http://schemas.microsoft.com/office/word/2015/wordml/symex" xmlns:wpg="http://schemas.microsoft.com/office/word/2010/wordprocessingGroup" xmlns:wpi="http://schemas.microsoft.com/office/word/2010/wordprocessingInk" xmlns:wne="http://schemas.microsoft.com/office/word/2006/wordml" xmlns:wps="http://schemas.microsoft.com/office/word/2010/wordprocessingShape" mc:Ignorable="w14 w15 w16se w16cid w16 w16cex w16sdtdh w16sdtfl w16du wp14">
   <w:abstractNum w:abstractNumId="0" w15:restartNumberingAfterBreak="0">
+    <w:nsid w:val="14E41B1F"/>
+    <w:multiLevelType w:val="multilevel"/>
+    <w:tmpl w:val="7B282F6C"/>
+    <w:lvl w:ilvl="0">
+      <w:start w:val="1"/>
+      <w:numFmt w:val="bullet"/>
+      <w:lvlText w:val=""/>
+      <w:lvlJc w:val="left"/>
+      <w:pPr>
+        <w:tabs>
+          <w:tab w:val="num" w:pos="720"/>
+        </w:tabs>
+        <w:ind w:left="720" w:hanging="360"/>
+      </w:pPr>
+      <w:rPr>
+        <w:rFonts w:ascii="Symbol" w:hAnsi="Symbol" w:hint="default"/>
+        <w:sz w:val="20"/>
+      </w:rPr>
+    </w:lvl>
+    <w:lvl w:ilvl="1" w:tentative="1">
+      <w:start w:val="1"/>
+      <w:numFmt w:val="bullet"/>
+      <w:lvlText w:val="o"/>
+      <w:lvlJc w:val="left"/>
+      <w:pPr>
+        <w:tabs>
+          <w:tab w:val="num" w:pos="1440"/>
+        </w:tabs>
+        <w:ind w:left="1440" w:hanging="360"/>
+      </w:pPr>
+      <w:rPr>
+        <w:rFonts w:ascii="Courier New" w:hAnsi="Courier New" w:hint="default"/>
+        <w:sz w:val="20"/>
+      </w:rPr>
+    </w:lvl>
+    <w:lvl w:ilvl="2" w:tentative="1">
+      <w:start w:val="1"/>
+      <w:numFmt w:val="bullet"/>
+      <w:lvlText w:val=""/>
+      <w:lvlJc w:val="left"/>
+      <w:pPr>
+        <w:tabs>
+          <w:tab w:val="num" w:pos="2160"/>
+        </w:tabs>
+        <w:ind w:left="2160" w:hanging="360"/>
+      </w:pPr>
+      <w:rPr>
+        <w:rFonts w:ascii="Wingdings" w:hAnsi="Wingdings" w:hint="default"/>
+        <w:sz w:val="20"/>
+      </w:rPr>
+    </w:lvl>
+    <w:lvl w:ilvl="3" w:tentative="1">
+      <w:start w:val="1"/>
+      <w:numFmt w:val="bullet"/>
+      <w:lvlText w:val=""/>
+      <w:lvlJc w:val="left"/>
+      <w:pPr>
+        <w:tabs>
+          <w:tab w:val="num" w:pos="2880"/>
+        </w:tabs>
+        <w:ind w:left="2880" w:hanging="360"/>
+      </w:pPr>
+      <w:rPr>
+        <w:rFonts w:ascii="Wingdings" w:hAnsi="Wingdings" w:hint="default"/>
+        <w:sz w:val="20"/>
+      </w:rPr>
+    </w:lvl>
+    <w:lvl w:ilvl="4" w:tentative="1">
+      <w:start w:val="1"/>
+      <w:numFmt w:val="bullet"/>
+      <w:lvlText w:val=""/>
+      <w:lvlJc w:val="left"/>
+      <w:pPr>
+        <w:tabs>
+          <w:tab w:val="num" w:pos="3600"/>
+        </w:tabs>
+        <w:ind w:left="3600" w:hanging="360"/>
+      </w:pPr>
+      <w:rPr>
+        <w:rFonts w:ascii="Wingdings" w:hAnsi="Wingdings" w:hint="default"/>
+        <w:sz w:val="20"/>
+      </w:rPr>
+    </w:lvl>
+    <w:lvl w:ilvl="5" w:tentative="1">
+      <w:start w:val="1"/>
+      <w:numFmt w:val="bullet"/>
+      <w:lvlText w:val=""/>
+      <w:lvlJc w:val="left"/>
+      <w:pPr>
+        <w:tabs>
+          <w:tab w:val="num" w:pos="4320"/>
+        </w:tabs>
+        <w:ind w:left="4320" w:hanging="360"/>
+      </w:pPr>
+      <w:rPr>
+        <w:rFonts w:ascii="Wingdings" w:hAnsi="Wingdings" w:hint="default"/>
+        <w:sz w:val="20"/>
+      </w:rPr>
+    </w:lvl>
+    <w:lvl w:ilvl="6" w:tentative="1">
+      <w:start w:val="1"/>
+      <w:numFmt w:val="bullet"/>
+      <w:lvlText w:val=""/>
+      <w:lvlJc w:val="left"/>
+      <w:pPr>
+        <w:tabs>
+          <w:tab w:val="num" w:pos="5040"/>
+        </w:tabs>
+        <w:ind w:left="5040" w:hanging="360"/>
+      </w:pPr>
+      <w:rPr>
+        <w:rFonts w:ascii="Wingdings" w:hAnsi="Wingdings" w:hint="default"/>
+        <w:sz w:val="20"/>
+      </w:rPr>
+    </w:lvl>
+    <w:lvl w:ilvl="7" w:tentative="1">
+      <w:start w:val="1"/>
+      <w:numFmt w:val="bullet"/>
+      <w:lvlText w:val=""/>
+      <w:lvlJc w:val="left"/>
+      <w:pPr>
+        <w:tabs>
+          <w:tab w:val="num" w:pos="5760"/>
+        </w:tabs>
+        <w:ind w:left="5760" w:hanging="360"/>
+      </w:pPr>
+      <w:rPr>
+        <w:rFonts w:ascii="Wingdings" w:hAnsi="Wingdings" w:hint="default"/>
+        <w:sz w:val="20"/>
+      </w:rPr>
+    </w:lvl>
+    <w:lvl w:ilvl="8" w:tentative="1">
+      <w:start w:val="1"/>
+      <w:numFmt w:val="bullet"/>
+      <w:lvlText w:val=""/>
+      <w:lvlJc w:val="left"/>
+      <w:pPr>
+        <w:tabs>
+          <w:tab w:val="num" w:pos="6480"/>
+        </w:tabs>
+        <w:ind w:left="6480" w:hanging="360"/>
+      </w:pPr>
+      <w:rPr>
+        <w:rFonts w:ascii="Wingdings" w:hAnsi="Wingdings" w:hint="default"/>
+        <w:sz w:val="20"/>
+      </w:rPr>
+    </w:lvl>
+  </w:abstractNum>
+  <w:abstractNum w:abstractNumId="1" w15:restartNumberingAfterBreak="0">
+    <w:nsid w:val="1B8A3175"/>
+    <w:multiLevelType w:val="multilevel"/>
+    <w:tmpl w:val="0C0EBB12"/>
+    <w:lvl w:ilvl="0">
+      <w:start w:val="1"/>
+      <w:numFmt w:val="bullet"/>
+      <w:lvlText w:val=""/>
+      <w:lvlJc w:val="left"/>
+      <w:pPr>
+        <w:tabs>
+          <w:tab w:val="num" w:pos="720"/>
+        </w:tabs>
+        <w:ind w:left="720" w:hanging="360"/>
+      </w:pPr>
+      <w:rPr>
+        <w:rFonts w:ascii="Symbol" w:hAnsi="Symbol" w:hint="default"/>
+        <w:sz w:val="20"/>
+      </w:rPr>
+    </w:lvl>
+    <w:lvl w:ilvl="1" w:tentative="1">
+      <w:start w:val="1"/>
+      <w:numFmt w:val="bullet"/>
+      <w:lvlText w:val="o"/>
+      <w:lvlJc w:val="left"/>
+      <w:pPr>
+        <w:tabs>
+          <w:tab w:val="num" w:pos="1440"/>
+        </w:tabs>
+        <w:ind w:left="1440" w:hanging="360"/>
+      </w:pPr>
+      <w:rPr>
+        <w:rFonts w:ascii="Courier New" w:hAnsi="Courier New" w:hint="default"/>
+        <w:sz w:val="20"/>
+      </w:rPr>
+    </w:lvl>
+    <w:lvl w:ilvl="2" w:tentative="1">
+      <w:start w:val="1"/>
+      <w:numFmt w:val="bullet"/>
+      <w:lvlText w:val=""/>
+      <w:lvlJc w:val="left"/>
+      <w:pPr>
+        <w:tabs>
+          <w:tab w:val="num" w:pos="2160"/>
+        </w:tabs>
+        <w:ind w:left="2160" w:hanging="360"/>
+      </w:pPr>
+      <w:rPr>
+        <w:rFonts w:ascii="Wingdings" w:hAnsi="Wingdings" w:hint="default"/>
+        <w:sz w:val="20"/>
+      </w:rPr>
+    </w:lvl>
+    <w:lvl w:ilvl="3" w:tentative="1">
+      <w:start w:val="1"/>
+      <w:numFmt w:val="bullet"/>
+      <w:lvlText w:val=""/>
+      <w:lvlJc w:val="left"/>
+      <w:pPr>
+        <w:tabs>
+          <w:tab w:val="num" w:pos="2880"/>
+        </w:tabs>
+        <w:ind w:left="2880" w:hanging="360"/>
+      </w:pPr>
+      <w:rPr>
+        <w:rFonts w:ascii="Wingdings" w:hAnsi="Wingdings" w:hint="default"/>
+        <w:sz w:val="20"/>
+      </w:rPr>
+    </w:lvl>
+    <w:lvl w:ilvl="4" w:tentative="1">
+      <w:start w:val="1"/>
+      <w:numFmt w:val="bullet"/>
+      <w:lvlText w:val=""/>
+      <w:lvlJc w:val="left"/>
+      <w:pPr>
+        <w:tabs>
+          <w:tab w:val="num" w:pos="3600"/>
+        </w:tabs>
+        <w:ind w:left="3600" w:hanging="360"/>
+      </w:pPr>
+      <w:rPr>
+        <w:rFonts w:ascii="Wingdings" w:hAnsi="Wingdings" w:hint="default"/>
+        <w:sz w:val="20"/>
+      </w:rPr>
+    </w:lvl>
+    <w:lvl w:ilvl="5" w:tentative="1">
+      <w:start w:val="1"/>
+      <w:numFmt w:val="bullet"/>
+      <w:lvlText w:val=""/>
+      <w:lvlJc w:val="left"/>
+      <w:pPr>
+        <w:tabs>
+          <w:tab w:val="num" w:pos="4320"/>
+        </w:tabs>
+        <w:ind w:left="4320" w:hanging="360"/>
+      </w:pPr>
+      <w:rPr>
+        <w:rFonts w:ascii="Wingdings" w:hAnsi="Wingdings" w:hint="default"/>
+        <w:sz w:val="20"/>
+      </w:rPr>
+    </w:lvl>
+    <w:lvl w:ilvl="6" w:tentative="1">
+      <w:start w:val="1"/>
+      <w:numFmt w:val="bullet"/>
+      <w:lvlText w:val=""/>
+      <w:lvlJc w:val="left"/>
+      <w:pPr>
+        <w:tabs>
+          <w:tab w:val="num" w:pos="5040"/>
+        </w:tabs>
+        <w:ind w:left="5040" w:hanging="360"/>
+      </w:pPr>
+      <w:rPr>
+        <w:rFonts w:ascii="Wingdings" w:hAnsi="Wingdings" w:hint="default"/>
+        <w:sz w:val="20"/>
+      </w:rPr>
+    </w:lvl>
+    <w:lvl w:ilvl="7" w:tentative="1">
+      <w:start w:val="1"/>
+      <w:numFmt w:val="bullet"/>
+      <w:lvlText w:val=""/>
+      <w:lvlJc w:val="left"/>
+      <w:pPr>
+        <w:tabs>
+          <w:tab w:val="num" w:pos="5760"/>
+        </w:tabs>
+        <w:ind w:left="5760" w:hanging="360"/>
+      </w:pPr>
+      <w:rPr>
+        <w:rFonts w:ascii="Wingdings" w:hAnsi="Wingdings" w:hint="default"/>
+        <w:sz w:val="20"/>
+      </w:rPr>
+    </w:lvl>
+    <w:lvl w:ilvl="8" w:tentative="1">
+      <w:start w:val="1"/>
+      <w:numFmt w:val="bullet"/>
+      <w:lvlText w:val=""/>
+      <w:lvlJc w:val="left"/>
+      <w:pPr>
+        <w:tabs>
+          <w:tab w:val="num" w:pos="6480"/>
+        </w:tabs>
+        <w:ind w:left="6480" w:hanging="360"/>
+      </w:pPr>
+      <w:rPr>
+        <w:rFonts w:ascii="Wingdings" w:hAnsi="Wingdings" w:hint="default"/>
+        <w:sz w:val="20"/>
+      </w:rPr>
+    </w:lvl>
+  </w:abstractNum>
+  <w:abstractNum w:abstractNumId="2" w15:restartNumberingAfterBreak="0">
     <w:nsid w:val="1F537618"/>
     <w:multiLevelType w:val="hybridMultilevel"/>
     <w:tmpl w:val="72DA6EEE"/>
@@ -6326,7 +7535,7 @@
       </w:rPr>
     </w:lvl>
   </w:abstractNum>
-  <w:abstractNum w:abstractNumId="1" w15:restartNumberingAfterBreak="0">
+  <w:abstractNum w:abstractNumId="3" w15:restartNumberingAfterBreak="0">
     <w:nsid w:val="3942500A"/>
     <w:multiLevelType w:val="hybridMultilevel"/>
     <w:tmpl w:val="92962D88"/>
@@ -6439,7 +7648,7 @@
       </w:rPr>
     </w:lvl>
   </w:abstractNum>
-  <w:abstractNum w:abstractNumId="2" w15:restartNumberingAfterBreak="0">
+  <w:abstractNum w:abstractNumId="4" w15:restartNumberingAfterBreak="0">
     <w:nsid w:val="4229625D"/>
     <w:multiLevelType w:val="multilevel"/>
     <w:tmpl w:val="5226F128"/>
@@ -6557,7 +7766,7 @@
       </w:rPr>
     </w:lvl>
   </w:abstractNum>
-  <w:abstractNum w:abstractNumId="3" w15:restartNumberingAfterBreak="0">
+  <w:abstractNum w:abstractNumId="5" w15:restartNumberingAfterBreak="0">
     <w:nsid w:val="4DCC3DAE"/>
     <w:multiLevelType w:val="hybridMultilevel"/>
     <w:tmpl w:val="9B9EA9CC"/>
@@ -6670,7 +7879,7 @@
       </w:rPr>
     </w:lvl>
   </w:abstractNum>
-  <w:abstractNum w:abstractNumId="4" w15:restartNumberingAfterBreak="0">
+  <w:abstractNum w:abstractNumId="6" w15:restartNumberingAfterBreak="0">
     <w:nsid w:val="52914A57"/>
     <w:multiLevelType w:val="hybridMultilevel"/>
     <w:tmpl w:val="590A6310"/>
@@ -6783,20 +7992,178 @@
       </w:rPr>
     </w:lvl>
   </w:abstractNum>
+  <w:abstractNum w:abstractNumId="7" w15:restartNumberingAfterBreak="0">
+    <w:nsid w:val="791616D7"/>
+    <w:multiLevelType w:val="multilevel"/>
+    <w:tmpl w:val="DFE28DD8"/>
+    <w:lvl w:ilvl="0">
+      <w:start w:val="1"/>
+      <w:numFmt w:val="bullet"/>
+      <w:lvlText w:val=""/>
+      <w:lvlJc w:val="left"/>
+      <w:pPr>
+        <w:tabs>
+          <w:tab w:val="num" w:pos="720"/>
+        </w:tabs>
+        <w:ind w:left="720" w:hanging="360"/>
+      </w:pPr>
+      <w:rPr>
+        <w:rFonts w:ascii="Symbol" w:hAnsi="Symbol" w:hint="default"/>
+        <w:sz w:val="20"/>
+      </w:rPr>
+    </w:lvl>
+    <w:lvl w:ilvl="1" w:tentative="1">
+      <w:start w:val="1"/>
+      <w:numFmt w:val="bullet"/>
+      <w:lvlText w:val="o"/>
+      <w:lvlJc w:val="left"/>
+      <w:pPr>
+        <w:tabs>
+          <w:tab w:val="num" w:pos="1440"/>
+        </w:tabs>
+        <w:ind w:left="1440" w:hanging="360"/>
+      </w:pPr>
+      <w:rPr>
+        <w:rFonts w:ascii="Courier New" w:hAnsi="Courier New" w:hint="default"/>
+        <w:sz w:val="20"/>
+      </w:rPr>
+    </w:lvl>
+    <w:lvl w:ilvl="2" w:tentative="1">
+      <w:start w:val="1"/>
+      <w:numFmt w:val="bullet"/>
+      <w:lvlText w:val=""/>
+      <w:lvlJc w:val="left"/>
+      <w:pPr>
+        <w:tabs>
+          <w:tab w:val="num" w:pos="2160"/>
+        </w:tabs>
+        <w:ind w:left="2160" w:hanging="360"/>
+      </w:pPr>
+      <w:rPr>
+        <w:rFonts w:ascii="Wingdings" w:hAnsi="Wingdings" w:hint="default"/>
+        <w:sz w:val="20"/>
+      </w:rPr>
+    </w:lvl>
+    <w:lvl w:ilvl="3" w:tentative="1">
+      <w:start w:val="1"/>
+      <w:numFmt w:val="bullet"/>
+      <w:lvlText w:val=""/>
+      <w:lvlJc w:val="left"/>
+      <w:pPr>
+        <w:tabs>
+          <w:tab w:val="num" w:pos="2880"/>
+        </w:tabs>
+        <w:ind w:left="2880" w:hanging="360"/>
+      </w:pPr>
+      <w:rPr>
+        <w:rFonts w:ascii="Wingdings" w:hAnsi="Wingdings" w:hint="default"/>
+        <w:sz w:val="20"/>
+      </w:rPr>
+    </w:lvl>
+    <w:lvl w:ilvl="4" w:tentative="1">
+      <w:start w:val="1"/>
+      <w:numFmt w:val="bullet"/>
+      <w:lvlText w:val=""/>
+      <w:lvlJc w:val="left"/>
+      <w:pPr>
+        <w:tabs>
+          <w:tab w:val="num" w:pos="3600"/>
+        </w:tabs>
+        <w:ind w:left="3600" w:hanging="360"/>
+      </w:pPr>
+      <w:rPr>
+        <w:rFonts w:ascii="Wingdings" w:hAnsi="Wingdings" w:hint="default"/>
+        <w:sz w:val="20"/>
+      </w:rPr>
+    </w:lvl>
+    <w:lvl w:ilvl="5" w:tentative="1">
+      <w:start w:val="1"/>
+      <w:numFmt w:val="bullet"/>
+      <w:lvlText w:val=""/>
+      <w:lvlJc w:val="left"/>
+      <w:pPr>
+        <w:tabs>
+          <w:tab w:val="num" w:pos="4320"/>
+        </w:tabs>
+        <w:ind w:left="4320" w:hanging="360"/>
+      </w:pPr>
+      <w:rPr>
+        <w:rFonts w:ascii="Wingdings" w:hAnsi="Wingdings" w:hint="default"/>
+        <w:sz w:val="20"/>
+      </w:rPr>
+    </w:lvl>
+    <w:lvl w:ilvl="6" w:tentative="1">
+      <w:start w:val="1"/>
+      <w:numFmt w:val="bullet"/>
+      <w:lvlText w:val=""/>
+      <w:lvlJc w:val="left"/>
+      <w:pPr>
+        <w:tabs>
+          <w:tab w:val="num" w:pos="5040"/>
+        </w:tabs>
+        <w:ind w:left="5040" w:hanging="360"/>
+      </w:pPr>
+      <w:rPr>
+        <w:rFonts w:ascii="Wingdings" w:hAnsi="Wingdings" w:hint="default"/>
+        <w:sz w:val="20"/>
+      </w:rPr>
+    </w:lvl>
+    <w:lvl w:ilvl="7" w:tentative="1">
+      <w:start w:val="1"/>
+      <w:numFmt w:val="bullet"/>
+      <w:lvlText w:val=""/>
+      <w:lvlJc w:val="left"/>
+      <w:pPr>
+        <w:tabs>
+          <w:tab w:val="num" w:pos="5760"/>
+        </w:tabs>
+        <w:ind w:left="5760" w:hanging="360"/>
+      </w:pPr>
+      <w:rPr>
+        <w:rFonts w:ascii="Wingdings" w:hAnsi="Wingdings" w:hint="default"/>
+        <w:sz w:val="20"/>
+      </w:rPr>
+    </w:lvl>
+    <w:lvl w:ilvl="8" w:tentative="1">
+      <w:start w:val="1"/>
+      <w:numFmt w:val="bullet"/>
+      <w:lvlText w:val=""/>
+      <w:lvlJc w:val="left"/>
+      <w:pPr>
+        <w:tabs>
+          <w:tab w:val="num" w:pos="6480"/>
+        </w:tabs>
+        <w:ind w:left="6480" w:hanging="360"/>
+      </w:pPr>
+      <w:rPr>
+        <w:rFonts w:ascii="Wingdings" w:hAnsi="Wingdings" w:hint="default"/>
+        <w:sz w:val="20"/>
+      </w:rPr>
+    </w:lvl>
+  </w:abstractNum>
   <w:num w:numId="1" w16cid:durableId="1100642781">
+    <w:abstractNumId w:val="4"/>
+  </w:num>
+  <w:num w:numId="2" w16cid:durableId="1312562576">
+    <w:abstractNumId w:val="6"/>
+  </w:num>
+  <w:num w:numId="3" w16cid:durableId="541593617">
+    <w:abstractNumId w:val="5"/>
+  </w:num>
+  <w:num w:numId="4" w16cid:durableId="948003397">
+    <w:abstractNumId w:val="3"/>
+  </w:num>
+  <w:num w:numId="5" w16cid:durableId="660279164">
     <w:abstractNumId w:val="2"/>
   </w:num>
-  <w:num w:numId="2" w16cid:durableId="1312562576">
-    <w:abstractNumId w:val="4"/>
-  </w:num>
-  <w:num w:numId="3" w16cid:durableId="541593617">
-    <w:abstractNumId w:val="3"/>
-  </w:num>
-  <w:num w:numId="4" w16cid:durableId="948003397">
+  <w:num w:numId="6" w16cid:durableId="198323746">
     <w:abstractNumId w:val="1"/>
   </w:num>
-  <w:num w:numId="5" w16cid:durableId="660279164">
+  <w:num w:numId="7" w16cid:durableId="1552840181">
     <w:abstractNumId w:val="0"/>
+  </w:num>
+  <w:num w:numId="8" w16cid:durableId="140000546">
+    <w:abstractNumId w:val="7"/>
   </w:num>
 </w:numbering>
 </file>
@@ -7203,7 +8570,6 @@
   <w:style w:type="character" w:default="1" w:styleId="Fuentedeprrafopredeter">
     <w:name w:val="Default Paragraph Font"/>
     <w:uiPriority w:val="1"/>
-    <w:semiHidden/>
     <w:unhideWhenUsed/>
   </w:style>
   <w:style w:type="table" w:default="1" w:styleId="Tablanormal">

</xml_diff>

<commit_message>
subir actualizacion de manuales
</commit_message>
<xml_diff>
--- a/01_proyecto/trim7/Manuales/Plan del Proyecto CMMI Nivel 2.docx
+++ b/01_proyecto/trim7/Manuales/Plan del Proyecto CMMI Nivel 2.docx
@@ -2936,10 +2936,7 @@
               <w:pStyle w:val="Sinespaciado"/>
             </w:pPr>
             <w:r>
-              <w:t>RF03</w:t>
-            </w:r>
-            <w:r>
-              <w:t>3</w:t>
+              <w:t>RF033</w:t>
             </w:r>
           </w:p>
         </w:tc>
@@ -4284,30 +4281,111 @@
         <w:pStyle w:val="Sinespaciado"/>
         <w:ind w:left="720"/>
         <w:rPr>
-          <w:b/>
-          <w:sz w:val="24"/>
-          <w:u w:val="single"/>
-        </w:rPr>
-      </w:pPr>
+          <w:bCs/>
+          <w:sz w:val="24"/>
+          <w:lang w:val="en-US"/>
+        </w:rPr>
+      </w:pPr>
+      <w:r>
+        <w:rPr>
+          <w:bCs/>
+          <w:sz w:val="24"/>
+          <w:lang w:val="en-US"/>
+        </w:rPr>
+        <w:t>Link</w:t>
+      </w:r>
     </w:p>
     <w:p>
       <w:pPr>
         <w:pStyle w:val="Sinespaciado"/>
         <w:ind w:left="720"/>
         <w:rPr>
+          <w:bCs/>
+          <w:sz w:val="24"/>
+          <w:lang w:val="en-US"/>
+        </w:rPr>
+      </w:pPr>
+      <w:r>
+        <w:rPr>
+          <w:bCs/>
+          <w:sz w:val="24"/>
+          <w:lang w:val="en-US"/>
+        </w:rPr>
+        <w:t xml:space="preserve">Link Git Hub: </w:t>
+      </w:r>
+    </w:p>
+    <w:p>
+      <w:pPr>
+        <w:pStyle w:val="Sinespaciado"/>
+        <w:ind w:left="720"/>
+        <w:rPr>
+          <w:bCs/>
+          <w:sz w:val="24"/>
+          <w:lang w:val="en-US"/>
+        </w:rPr>
+      </w:pPr>
+      <w:hyperlink r:id="rId9" w:history="1">
+        <w:r>
+          <w:rPr>
+            <w:rStyle w:val="Hipervnculo"/>
+            <w:bCs/>
+            <w:sz w:val="24"/>
+            <w:lang w:val="en-US"/>
+          </w:rPr>
+          <w:t>https://github.com/Katherin22/zefiro/blob/Test/01_proyecto/trim2/04_estimacion_costos/ficha%20tecnica%20.xlsx</w:t>
+        </w:r>
+      </w:hyperlink>
+    </w:p>
+    <w:p>
+      <w:pPr>
+        <w:pStyle w:val="Sinespaciado"/>
+        <w:ind w:left="720"/>
+        <w:rPr>
           <w:rStyle w:val="Hipervnculo"/>
           <w:sz w:val="24"/>
           <w:szCs w:val="24"/>
-        </w:rPr>
-      </w:pPr>
-      <w:hyperlink r:id="rId9" w:history="1">
+          <w:lang w:val="en-US"/>
+        </w:rPr>
+      </w:pPr>
+      <w:r>
+        <w:rPr>
+          <w:lang w:val="en-US"/>
+        </w:rPr>
+        <w:t>Link</w:t>
+      </w:r>
+      <w:r>
+        <w:rPr>
+          <w:lang w:val="en-US"/>
+        </w:rPr>
+        <w:t xml:space="preserve"> drive: </w:t>
+      </w:r>
+      <w:hyperlink r:id="rId10" w:history="1">
         <w:r>
           <w:rPr>
             <w:rStyle w:val="Hipervnculo"/>
             <w:sz w:val="24"/>
             <w:szCs w:val="24"/>
+            <w:lang w:val="en-US"/>
           </w:rPr>
-          <w:t>https://docs.google.com/spreadsheets/d/1Hp_mLhCEBgqtfFRPlIcuQNST8jooyhp1/edit?usp=sharing&amp;ouid=110984401584463252056&amp;rtpof=true&amp;sd=true</w:t>
+          <w:t>https://docs.google.com/spreadsh</w:t>
+        </w:r>
+        <w:r>
+          <w:rPr>
+            <w:rStyle w:val="Hipervnculo"/>
+            <w:sz w:val="24"/>
+            <w:szCs w:val="24"/>
+            <w:lang w:val="en-US"/>
+          </w:rPr>
+          <w:t>e</w:t>
+        </w:r>
+        <w:r>
+          <w:rPr>
+            <w:rStyle w:val="Hipervnculo"/>
+            <w:sz w:val="24"/>
+            <w:szCs w:val="24"/>
+            <w:lang w:val="en-US"/>
+          </w:rPr>
+          <w:t>ets/d/1Hp_mLhCEBgqtfFRPlIcuQNST8jooyhp1/edit?usp=sharing&amp;ouid=110984401584463252056&amp;rtpof=true&amp;sd=true</w:t>
         </w:r>
       </w:hyperlink>
     </w:p>
@@ -4319,6 +4397,7 @@
           <w:rStyle w:val="Hipervnculo"/>
           <w:sz w:val="24"/>
           <w:szCs w:val="24"/>
+          <w:lang w:val="en-US"/>
         </w:rPr>
       </w:pPr>
     </w:p>
@@ -4521,7 +4600,7 @@
           <w:u w:val="single"/>
         </w:rPr>
       </w:pPr>
-      <w:hyperlink r:id="rId10" w:history="1">
+      <w:hyperlink r:id="rId11" w:history="1">
         <w:r>
           <w:rPr>
             <w:rStyle w:val="Hipervnculo"/>
@@ -5833,8 +5912,139 @@
         <w:rPr>
           <w:sz w:val="24"/>
         </w:rPr>
-        <w:t>Pruebas Integración</w:t>
-      </w:r>
+        <w:t xml:space="preserve">Pruebas </w:t>
+      </w:r>
+      <w:r>
+        <w:rPr>
+          <w:sz w:val="24"/>
+        </w:rPr>
+        <w:t xml:space="preserve">aceptación </w:t>
+      </w:r>
+    </w:p>
+    <w:p>
+      <w:pPr>
+        <w:pStyle w:val="Sinespaciado"/>
+        <w:ind w:left="1080"/>
+        <w:rPr>
+          <w:sz w:val="24"/>
+          <w:lang w:val="en-US"/>
+        </w:rPr>
+      </w:pPr>
+      <w:r>
+        <w:rPr>
+          <w:sz w:val="24"/>
+          <w:lang w:val="en-US"/>
+        </w:rPr>
+        <w:t xml:space="preserve">Link </w:t>
+      </w:r>
+      <w:proofErr w:type="spellStart"/>
+      <w:r>
+        <w:rPr>
+          <w:sz w:val="24"/>
+          <w:lang w:val="en-US"/>
+        </w:rPr>
+        <w:t>git</w:t>
+      </w:r>
+      <w:r>
+        <w:rPr>
+          <w:sz w:val="24"/>
+          <w:lang w:val="en-US"/>
+        </w:rPr>
+        <w:t>Hub</w:t>
+      </w:r>
+      <w:proofErr w:type="spellEnd"/>
+      <w:r>
+        <w:rPr>
+          <w:sz w:val="24"/>
+          <w:lang w:val="en-US"/>
+        </w:rPr>
+        <w:t xml:space="preserve">: </w:t>
+      </w:r>
+      <w:hyperlink r:id="rId12" w:history="1">
+        <w:r>
+          <w:rPr>
+            <w:rStyle w:val="Hipervnculo"/>
+            <w:sz w:val="24"/>
+            <w:lang w:val="en-US"/>
+          </w:rPr>
+          <w:t>https://github.com/Katherin-22/zefiro/blob/Test/01_proyecto/trim7/Pruebas/PGTI-09-04%20Formato%20de%20Pruebas%20Sistemas%20de%20Inf%20(1).xlsx</w:t>
+        </w:r>
+      </w:hyperlink>
+    </w:p>
+    <w:p>
+      <w:pPr>
+        <w:pStyle w:val="Sinespaciado"/>
+        <w:ind w:left="1080"/>
+        <w:rPr>
+          <w:sz w:val="24"/>
+          <w:lang w:val="en-US"/>
+        </w:rPr>
+      </w:pPr>
+      <w:r>
+        <w:rPr>
+          <w:sz w:val="24"/>
+          <w:lang w:val="en-US"/>
+        </w:rPr>
+        <w:t xml:space="preserve">Link drive: </w:t>
+      </w:r>
+      <w:hyperlink r:id="rId13" w:history="1">
+        <w:r>
+          <w:rPr>
+            <w:rStyle w:val="Hipervnculo"/>
+            <w:sz w:val="24"/>
+            <w:lang w:val="en-US"/>
+          </w:rPr>
+          <w:t>https://do</w:t>
+        </w:r>
+        <w:r>
+          <w:rPr>
+            <w:rStyle w:val="Hipervnculo"/>
+            <w:sz w:val="24"/>
+            <w:lang w:val="en-US"/>
+          </w:rPr>
+          <w:t>c</w:t>
+        </w:r>
+        <w:r>
+          <w:rPr>
+            <w:rStyle w:val="Hipervnculo"/>
+            <w:sz w:val="24"/>
+            <w:lang w:val="en-US"/>
+          </w:rPr>
+          <w:t>s.google.com/spreadsheets/d/1oEaEprsoSktNrcrN42fhelJGT4vtv3wU/edit?usp=sharin</w:t>
+        </w:r>
+        <w:r>
+          <w:rPr>
+            <w:rStyle w:val="Hipervnculo"/>
+            <w:sz w:val="24"/>
+            <w:lang w:val="en-US"/>
+          </w:rPr>
+          <w:t>g</w:t>
+        </w:r>
+        <w:r>
+          <w:rPr>
+            <w:rStyle w:val="Hipervnculo"/>
+            <w:sz w:val="24"/>
+            <w:lang w:val="en-US"/>
+          </w:rPr>
+          <w:t>&amp;oui</w:t>
+        </w:r>
+        <w:r>
+          <w:rPr>
+            <w:rStyle w:val="Hipervnculo"/>
+            <w:sz w:val="24"/>
+            <w:lang w:val="en-US"/>
+          </w:rPr>
+          <w:t>d</w:t>
+        </w:r>
+        <w:r>
+          <w:rPr>
+            <w:rStyle w:val="Hipervnculo"/>
+            <w:sz w:val="24"/>
+            <w:lang w:val="en-US"/>
+          </w:rPr>
+          <w:t>=107008413932286754626&amp;rtpof=true&amp;sd=true</w:t>
+        </w:r>
+      </w:hyperlink>
     </w:p>
     <w:p>
       <w:pPr>
@@ -5842,6 +6052,7 @@
         <w:ind w:left="1440"/>
         <w:rPr>
           <w:sz w:val="24"/>
+          <w:lang w:val="en-US"/>
         </w:rPr>
       </w:pPr>
     </w:p>
@@ -8570,6 +8781,7 @@
   <w:style w:type="character" w:default="1" w:styleId="Fuentedeprrafopredeter">
     <w:name w:val="Default Paragraph Font"/>
     <w:uiPriority w:val="1"/>
+    <w:semiHidden/>
     <w:unhideWhenUsed/>
   </w:style>
   <w:style w:type="table" w:default="1" w:styleId="Tablanormal">

</xml_diff>